<commit_message>
Version 1.2 - Nuevos cambos visuales y de busqueda de etiquetas
</commit_message>
<xml_diff>
--- a/Docs/Manual usuario gestor de etiquetas.docx
+++ b/Docs/Manual usuario gestor de etiquetas.docx
@@ -24,15 +24,7 @@
         <w:t>,</w:t>
       </w:r>
       <w:r>
-        <w:t xml:space="preserve"> para generar las fabricaciones utilizan las regularizaciones, en las cuales insertan manualmente los lotes de los productos de materia prima que </w:t>
-      </w:r>
-      <w:proofErr w:type="gramStart"/>
-      <w:r>
-        <w:t>van</w:t>
-      </w:r>
-      <w:proofErr w:type="gramEnd"/>
-      <w:r>
-        <w:t xml:space="preserve"> usar en negativo. Por ejemplo, insertan las piezas de atún con su lote que van a usar </w:t>
+        <w:t xml:space="preserve"> para generar las fabricaciones utilizan las regularizaciones, en las cuales insertan manualmente los lotes de los productos de materia prima que van usar en negativo. Por ejemplo, insertan las piezas de atún con su lote que van a usar </w:t>
       </w:r>
       <w:r>
         <w:t>para generar el despiece.</w:t>
@@ -82,11 +74,9 @@
           <w:numId w:val="39"/>
         </w:numPr>
       </w:pPr>
-      <w:proofErr w:type="spellStart"/>
       <w:r>
         <w:t>GestorEtiquetado</w:t>
       </w:r>
-      <w:proofErr w:type="spellEnd"/>
     </w:p>
     <w:p>
       <w:r>
@@ -122,27 +112,14 @@
       </w:r>
     </w:p>
     <w:p>
-      <w:proofErr w:type="spellStart"/>
-      <w:r>
-        <w:t>DllgestorEtiquetado</w:t>
-      </w:r>
-      <w:proofErr w:type="spellEnd"/>
-      <w:r>
-        <w:t xml:space="preserve"> </w:t>
+      <w:r>
+        <w:t xml:space="preserve">DllgestorEtiquetado </w:t>
       </w:r>
       <w:r>
         <w:sym w:font="Wingdings" w:char="F0E0"/>
       </w:r>
       <w:r>
-        <w:t xml:space="preserve"> </w:t>
-      </w:r>
-      <w:proofErr w:type="spellStart"/>
-      <w:r>
-        <w:t>Dll</w:t>
-      </w:r>
-      <w:proofErr w:type="spellEnd"/>
-      <w:r>
-        <w:t xml:space="preserve"> de la funcionalidad</w:t>
+        <w:t xml:space="preserve"> Dll de la funcionalidad</w:t>
       </w:r>
     </w:p>
     <w:p>
@@ -185,13 +162,8 @@
             <w:tcW w:w="9629" w:type="dxa"/>
           </w:tcPr>
           <w:p>
-            <w:proofErr w:type="gramStart"/>
             <w:r>
-              <w:t>;Datos</w:t>
-            </w:r>
-            <w:proofErr w:type="gramEnd"/>
-            <w:r>
-              <w:t xml:space="preserve"> para Nexus/A3Erp</w:t>
+              <w:t>;Datos para Nexus/A3Erp</w:t>
             </w:r>
           </w:p>
           <w:p>
@@ -201,136 +173,61 @@
             </w:r>
           </w:p>
           <w:p>
-            <w:proofErr w:type="gramStart"/>
             <w:r>
-              <w:t>;Nombre</w:t>
-            </w:r>
-            <w:proofErr w:type="gramEnd"/>
-            <w:r>
-              <w:t xml:space="preserve"> de la base de datos registrada en </w:t>
-            </w:r>
-            <w:proofErr w:type="spellStart"/>
-            <w:r>
-              <w:t>SQLServer</w:t>
-            </w:r>
-            <w:proofErr w:type="spellEnd"/>
-          </w:p>
-          <w:p>
-            <w:proofErr w:type="gramStart"/>
-            <w:r>
-              <w:t>;*</w:t>
-            </w:r>
-            <w:proofErr w:type="gramEnd"/>
-            <w:r>
-              <w:t>* Parámetro básico de configuración Nexus/A3Erp</w:t>
-            </w:r>
-          </w:p>
-          <w:p>
-            <w:proofErr w:type="spellStart"/>
-            <w:r>
-              <w:t>BaseDatos</w:t>
-            </w:r>
-            <w:proofErr w:type="spellEnd"/>
-            <w:r>
-              <w:t>=</w:t>
-            </w:r>
-            <w:proofErr w:type="spellStart"/>
-            <w:r>
-              <w:t>SalazonesSaez</w:t>
-            </w:r>
-            <w:proofErr w:type="spellEnd"/>
-          </w:p>
-          <w:p/>
-          <w:p>
-            <w:proofErr w:type="gramStart"/>
-            <w:r>
-              <w:t>;Nombre</w:t>
-            </w:r>
-            <w:proofErr w:type="gramEnd"/>
-            <w:r>
-              <w:t xml:space="preserve"> de la empresa registrada en Nexus/A3Erp</w:t>
-            </w:r>
-          </w:p>
-          <w:p>
-            <w:proofErr w:type="gramStart"/>
-            <w:r>
-              <w:t>;*</w:t>
-            </w:r>
-            <w:proofErr w:type="gramEnd"/>
-            <w:r>
-              <w:t>* Parámetro básico de configuración</w:t>
+              <w:t>;Nombre de la base de datos registrada en SQLServer</w:t>
             </w:r>
           </w:p>
           <w:p>
             <w:r>
-              <w:t>Empresa=</w:t>
-            </w:r>
-            <w:proofErr w:type="spellStart"/>
-            <w:r>
-              <w:t>SalazonesSaez</w:t>
-            </w:r>
-            <w:proofErr w:type="spellEnd"/>
-          </w:p>
-          <w:p/>
-          <w:p>
-            <w:proofErr w:type="gramStart"/>
-            <w:r>
-              <w:t>;Contraseña</w:t>
-            </w:r>
-            <w:proofErr w:type="gramEnd"/>
-            <w:r>
-              <w:t xml:space="preserve"> de </w:t>
-            </w:r>
-            <w:proofErr w:type="spellStart"/>
-            <w:r>
-              <w:t>sa</w:t>
-            </w:r>
-            <w:proofErr w:type="spellEnd"/>
-          </w:p>
-          <w:p>
-            <w:proofErr w:type="gramStart"/>
-            <w:r>
-              <w:t>;*</w:t>
-            </w:r>
-            <w:proofErr w:type="gramEnd"/>
-            <w:r>
-              <w:t>* Parámetro básico de configuración con Nexus/A3Erp</w:t>
+              <w:t>;** Parámetro básico de configuración Nexus/A3Erp</w:t>
             </w:r>
           </w:p>
           <w:p>
-            <w:proofErr w:type="spellStart"/>
             <w:r>
-              <w:t>Password</w:t>
-            </w:r>
-            <w:proofErr w:type="spellEnd"/>
-            <w:r>
-              <w:t>=w6DCocOmw6bDrsW4w6TDiA==</w:t>
+              <w:t>BaseDatos=SalazonesSaez</w:t>
             </w:r>
           </w:p>
           <w:p/>
           <w:p>
-            <w:proofErr w:type="gramStart"/>
             <w:r>
-              <w:t>;Instancia</w:t>
+              <w:t>;Nombre de la empresa registrada en Nexus/A3Erp</w:t>
             </w:r>
-            <w:proofErr w:type="gramEnd"/>
-            <w:r>
-              <w:t xml:space="preserve"> del servidor </w:t>
-            </w:r>
-            <w:proofErr w:type="spellStart"/>
-            <w:r>
-              <w:t>SQLSever</w:t>
-            </w:r>
-            <w:proofErr w:type="spellEnd"/>
           </w:p>
           <w:p>
-            <w:proofErr w:type="gramStart"/>
             <w:r>
-              <w:t>;*</w:t>
+              <w:t>;** Parámetro básico de configuración</w:t>
             </w:r>
-            <w:proofErr w:type="gramEnd"/>
+          </w:p>
+          <w:p>
             <w:r>
-              <w:t>* Parámetro básico de configuración con Nexus/A3Erp</w:t>
+              <w:t>Empresa=SalazonesSaez</w:t>
+            </w:r>
+          </w:p>
+          <w:p/>
+          <w:p>
+            <w:r>
+              <w:t>;Contraseña de sa</w:t>
+            </w:r>
+          </w:p>
+          <w:p>
+            <w:r>
+              <w:t>;** Parámetro básico de configuración con Nexus/A3Erp</w:t>
+            </w:r>
+          </w:p>
+          <w:p>
+            <w:r>
+              <w:t>Password=w6DCocOmw6bDrsW4w6TDiA==</w:t>
+            </w:r>
+          </w:p>
+          <w:p/>
+          <w:p>
+            <w:r>
+              <w:t>;Instancia del servidor SQLSever</w:t>
+            </w:r>
+          </w:p>
+          <w:p>
+            <w:r>
+              <w:t>;** Parámetro básico de configuración con Nexus/A3Erp</w:t>
             </w:r>
           </w:p>
           <w:p>
@@ -344,34 +241,19 @@
             </w:r>
           </w:p>
           <w:p>
-            <w:proofErr w:type="spellStart"/>
             <w:r>
-              <w:t>Ip</w:t>
-            </w:r>
-            <w:proofErr w:type="spellEnd"/>
-            <w:r>
-              <w:t>=</w:t>
+              <w:t>Ip=</w:t>
             </w:r>
           </w:p>
           <w:p/>
           <w:p>
-            <w:proofErr w:type="gramStart"/>
             <w:r>
-              <w:t>;Base</w:t>
-            </w:r>
-            <w:proofErr w:type="gramEnd"/>
-            <w:r>
-              <w:t xml:space="preserve"> de datos de sistema de Nexus/A3Erp</w:t>
+              <w:t>;Base de datos de sistema de Nexus/A3Erp</w:t>
             </w:r>
           </w:p>
           <w:p>
-            <w:proofErr w:type="gramStart"/>
             <w:r>
-              <w:t>;*</w:t>
-            </w:r>
-            <w:proofErr w:type="gramEnd"/>
-            <w:r>
-              <w:t>* Parámetro básico de configuración Nexus/A3Erp</w:t>
+              <w:t>;** Parámetro básico de configuración Nexus/A3Erp</w:t>
             </w:r>
           </w:p>
           <w:p>
@@ -381,49 +263,24 @@
           </w:p>
           <w:p/>
           <w:p>
-            <w:proofErr w:type="gramStart"/>
             <w:r>
-              <w:t>;Usuario</w:t>
-            </w:r>
-            <w:proofErr w:type="gramEnd"/>
-            <w:r>
-              <w:t xml:space="preserve"> de </w:t>
-            </w:r>
-            <w:proofErr w:type="spellStart"/>
-            <w:r>
-              <w:t>SQLServer</w:t>
-            </w:r>
-            <w:proofErr w:type="spellEnd"/>
-          </w:p>
-          <w:p>
-            <w:proofErr w:type="gramStart"/>
-            <w:r>
-              <w:t>;*</w:t>
-            </w:r>
-            <w:proofErr w:type="gramEnd"/>
-            <w:r>
-              <w:t>* Parámetro básico de configuración Nexus/A3Erp</w:t>
+              <w:t>;Usuario de SQLServer</w:t>
             </w:r>
           </w:p>
           <w:p>
             <w:r>
-              <w:t>Usuario=</w:t>
+              <w:t>;** Parámetro básico de configuración Nexus/A3Erp</w:t>
             </w:r>
-            <w:proofErr w:type="spellStart"/>
+          </w:p>
+          <w:p>
             <w:r>
-              <w:t>sa</w:t>
+              <w:t>Usuario=sa</w:t>
             </w:r>
-            <w:proofErr w:type="spellEnd"/>
           </w:p>
           <w:p/>
           <w:p>
-            <w:proofErr w:type="spellStart"/>
             <w:r>
-              <w:t>NombreArchivoLog</w:t>
-            </w:r>
-            <w:proofErr w:type="spellEnd"/>
-            <w:r>
-              <w:t xml:space="preserve"> = E:\Repositorios\SalazonesSaez\GestorEtiquetado\Logs\log.txt</w:t>
+              <w:t>NombreArchivoLog = E:\Repositorios\SalazonesSaez\GestorEtiquetado\Logs\log.txt</w:t>
             </w:r>
           </w:p>
           <w:p/>
@@ -433,13 +290,8 @@
             </w:r>
           </w:p>
           <w:p>
-            <w:proofErr w:type="gramStart"/>
             <w:r>
-              <w:t>;Timer</w:t>
-            </w:r>
-            <w:proofErr w:type="gramEnd"/>
-            <w:r>
-              <w:t xml:space="preserve"> espera</w:t>
+              <w:t>;Timer espera</w:t>
             </w:r>
           </w:p>
           <w:p>
@@ -471,14 +323,9 @@
           </w:p>
           <w:p/>
           <w:p>
-            <w:proofErr w:type="gramStart"/>
             <w:r>
               <w:lastRenderedPageBreak/>
-              <w:t>;Almacen</w:t>
-            </w:r>
-            <w:proofErr w:type="gramEnd"/>
-            <w:r>
-              <w:t xml:space="preserve"> para las regularizaciones</w:t>
+              <w:t>;Almacen para las regularizaciones</w:t>
             </w:r>
           </w:p>
           <w:p>
@@ -488,111 +335,56 @@
           </w:p>
           <w:p/>
           <w:p>
-            <w:proofErr w:type="gramStart"/>
             <w:r>
-              <w:t>;</w:t>
-            </w:r>
-            <w:proofErr w:type="spellStart"/>
-            <w:r>
-              <w:t>Impresion</w:t>
-            </w:r>
-            <w:proofErr w:type="spellEnd"/>
-            <w:proofErr w:type="gramEnd"/>
-            <w:r>
-              <w:t xml:space="preserve"> </w:t>
-            </w:r>
-            <w:proofErr w:type="spellStart"/>
-            <w:r>
-              <w:t>automatica</w:t>
-            </w:r>
-            <w:proofErr w:type="spellEnd"/>
-            <w:r>
-              <w:t xml:space="preserve"> para que imprima cada vez que pese un producto</w:t>
+              <w:t>;Impresion automatica para que imprima cada vez que pese un producto</w:t>
             </w:r>
           </w:p>
           <w:p>
-            <w:proofErr w:type="spellStart"/>
             <w:r>
-              <w:t>ImpresionAutomatica</w:t>
-            </w:r>
-            <w:proofErr w:type="spellEnd"/>
-            <w:r>
-              <w:t xml:space="preserve"> = T</w:t>
+              <w:t>ImpresionAutomatica = T</w:t>
             </w:r>
           </w:p>
           <w:p/>
           <w:p>
-            <w:proofErr w:type="gramStart"/>
             <w:r>
-              <w:t>;</w:t>
-            </w:r>
-            <w:proofErr w:type="spellStart"/>
-            <w:r>
-              <w:t>Parametros</w:t>
-            </w:r>
-            <w:proofErr w:type="spellEnd"/>
-            <w:proofErr w:type="gramEnd"/>
-            <w:r>
-              <w:t xml:space="preserve"> fijos para el diseño de etiquetas</w:t>
+              <w:t>;Parametros fijos para el diseño de etiquetas</w:t>
             </w:r>
           </w:p>
           <w:p>
-            <w:proofErr w:type="spellStart"/>
             <w:r>
-              <w:t>ParamCodCli</w:t>
-            </w:r>
-            <w:proofErr w:type="spellEnd"/>
-            <w:r>
-              <w:t xml:space="preserve"> = 10</w:t>
+              <w:t>ParamCodCli = 10</w:t>
             </w:r>
           </w:p>
           <w:p>
-            <w:proofErr w:type="spellStart"/>
             <w:r>
-              <w:t>ParamLote</w:t>
-            </w:r>
-            <w:proofErr w:type="spellEnd"/>
-            <w:r>
-              <w:t xml:space="preserve"> = L012226</w:t>
+              <w:t>ParamLote = L012226</w:t>
             </w:r>
           </w:p>
           <w:p>
-            <w:proofErr w:type="spellStart"/>
             <w:r>
-              <w:t>Paramid</w:t>
-            </w:r>
-            <w:proofErr w:type="spellEnd"/>
-            <w:r>
-              <w:t xml:space="preserve"> = 1</w:t>
+              <w:t>Paramid = 1</w:t>
             </w:r>
           </w:p>
           <w:p/>
           <w:p>
-            <w:proofErr w:type="gramStart"/>
             <w:r>
-              <w:t>;Impresora</w:t>
-            </w:r>
-            <w:proofErr w:type="gramEnd"/>
-            <w:r>
-              <w:t xml:space="preserve"> para las etiquetas</w:t>
+              <w:t>;Impresora para las etiquetas</w:t>
             </w:r>
           </w:p>
           <w:p>
-            <w:proofErr w:type="spellStart"/>
             <w:r>
-              <w:t>ImpresoraEtiArt</w:t>
+              <w:t>ImpresoraEtiArt = A3 Printer PDF</w:t>
             </w:r>
-            <w:proofErr w:type="spellEnd"/>
+          </w:p>
+          <w:p/>
+          <w:p>
             <w:r>
-              <w:t xml:space="preserve"> = A3 </w:t>
+              <w:t>;Código de la etiqueta por defecto</w:t>
             </w:r>
-            <w:proofErr w:type="spellStart"/>
+          </w:p>
+          <w:p>
             <w:r>
-              <w:t>Printer</w:t>
-            </w:r>
-            <w:proofErr w:type="spellEnd"/>
-            <w:r>
-              <w:t xml:space="preserve"> PDF</w:t>
+              <w:t>Etiqueta = 1</w:t>
             </w:r>
           </w:p>
           <w:p/>
@@ -617,15 +409,7 @@
     </w:p>
     <w:p>
       <w:r>
-        <w:t xml:space="preserve">Son los datos de configuración generales para la conexión con la </w:t>
-      </w:r>
-      <w:proofErr w:type="spellStart"/>
-      <w:r>
-        <w:t>bbdd</w:t>
-      </w:r>
-      <w:proofErr w:type="spellEnd"/>
-      <w:r>
-        <w:t xml:space="preserve"> y la empresa con la que vamos a trabajar</w:t>
+        <w:t>Son los datos de configuración generales para la conexión con la bbdd y la empresa con la que vamos a trabajar</w:t>
       </w:r>
     </w:p>
     <w:p>
@@ -666,10 +450,7 @@
         <w:spacing w:after="0" w:line="240" w:lineRule="auto"/>
       </w:pPr>
       <w:r>
-        <w:t>Timer =</w:t>
-      </w:r>
-      <w:r>
-        <w:t xml:space="preserve"> Tiempo en ms que esperará la bascula entre lectura y lectura</w:t>
+        <w:t>Timer = Tiempo en ms que esperará la bascula entre lectura y lectura</w:t>
       </w:r>
     </w:p>
     <w:p>
@@ -682,10 +463,7 @@
         <w:spacing w:after="0" w:line="240" w:lineRule="auto"/>
       </w:pPr>
       <w:r>
-        <w:t>Bascula =</w:t>
-      </w:r>
-      <w:r>
-        <w:t xml:space="preserve"> Código de la bascula que realiza la lectura</w:t>
+        <w:t>Bascula = Código de la bascula que realiza la lectura</w:t>
       </w:r>
     </w:p>
     <w:p>
@@ -695,10 +473,7 @@
     </w:p>
     <w:p>
       <w:r>
-        <w:t>Descarte =</w:t>
-      </w:r>
-      <w:r>
-        <w:t xml:space="preserve"> Peso de descarte en las pesadas.</w:t>
+        <w:t>Descarte = Peso de descarte en las pesadas.</w:t>
       </w:r>
     </w:p>
     <w:p>
@@ -723,40 +498,8 @@
       <w:pPr>
         <w:spacing w:after="0" w:line="240" w:lineRule="auto"/>
       </w:pPr>
-      <w:proofErr w:type="spellStart"/>
-      <w:r>
-        <w:t>ImpresionAutomatica</w:t>
-      </w:r>
-      <w:proofErr w:type="spellEnd"/>
-      <w:r>
-        <w:t xml:space="preserve"> = </w:t>
-      </w:r>
-      <w:proofErr w:type="spellStart"/>
-      <w:r>
-        <w:t>Impresion</w:t>
-      </w:r>
-      <w:proofErr w:type="spellEnd"/>
-      <w:r>
-        <w:t xml:space="preserve"> </w:t>
-      </w:r>
-      <w:proofErr w:type="spellStart"/>
-      <w:r>
-        <w:t>automatica</w:t>
-      </w:r>
-      <w:proofErr w:type="spellEnd"/>
-      <w:r>
-        <w:t xml:space="preserve"> para que imprima cada vez que pese un producto</w:t>
-      </w:r>
-      <w:r>
-        <w:t xml:space="preserve"> (</w:t>
-      </w:r>
-      <w:proofErr w:type="gramStart"/>
-      <w:r>
-        <w:t>T,F</w:t>
-      </w:r>
-      <w:proofErr w:type="gramEnd"/>
-      <w:r>
-        <w:t>)</w:t>
+      <w:r>
+        <w:t>ImpresionAutomatica = Impresion automatica para que imprima cada vez que pese un producto (T,F)</w:t>
       </w:r>
     </w:p>
     <w:p>
@@ -768,71 +511,33 @@
       <w:pPr>
         <w:spacing w:after="0" w:line="240" w:lineRule="auto"/>
       </w:pPr>
-      <w:proofErr w:type="gramStart"/>
-      <w:r>
-        <w:t>;</w:t>
-      </w:r>
-      <w:proofErr w:type="spellStart"/>
-      <w:r>
-        <w:t>Parametros</w:t>
-      </w:r>
-      <w:proofErr w:type="spellEnd"/>
-      <w:proofErr w:type="gramEnd"/>
-      <w:r>
-        <w:t xml:space="preserve"> fijos para el diseño de etiquetas</w:t>
+      <w:r>
+        <w:t>;Parametros fijos para el diseño de etiquetas</w:t>
       </w:r>
     </w:p>
     <w:p>
       <w:pPr>
         <w:spacing w:after="0" w:line="240" w:lineRule="auto"/>
       </w:pPr>
-      <w:proofErr w:type="spellStart"/>
-      <w:r>
-        <w:t>ParamCodCli</w:t>
-      </w:r>
-      <w:proofErr w:type="spellEnd"/>
-      <w:r>
-        <w:t xml:space="preserve"> = </w:t>
-      </w:r>
-      <w:proofErr w:type="spellStart"/>
-      <w:r>
-        <w:t>Codigo</w:t>
-      </w:r>
-      <w:proofErr w:type="spellEnd"/>
-      <w:r>
-        <w:t xml:space="preserve"> de cliente</w:t>
+      <w:r>
+        <w:t>ParamCodCli = Codigo de cliente</w:t>
       </w:r>
     </w:p>
     <w:p>
       <w:pPr>
         <w:spacing w:after="0" w:line="240" w:lineRule="auto"/>
       </w:pPr>
-      <w:proofErr w:type="spellStart"/>
-      <w:r>
-        <w:t>ParamLote</w:t>
-      </w:r>
-      <w:proofErr w:type="spellEnd"/>
-      <w:r>
-        <w:t xml:space="preserve"> = </w:t>
-      </w:r>
-      <w:r>
-        <w:t>Lote</w:t>
+      <w:r>
+        <w:t>ParamLote = Lote</w:t>
       </w:r>
     </w:p>
     <w:p>
       <w:pPr>
         <w:spacing w:after="0" w:line="240" w:lineRule="auto"/>
       </w:pPr>
-      <w:proofErr w:type="spellStart"/>
-      <w:r>
-        <w:t>Paramid</w:t>
-      </w:r>
-      <w:proofErr w:type="spellEnd"/>
-      <w:r>
-        <w:t xml:space="preserve"> = </w:t>
-      </w:r>
-      <w:r>
-        <w:t>Id de la pesada</w:t>
+      <w:r>
+        <w:lastRenderedPageBreak/>
+        <w:t>Paramid = Id de la pesada</w:t>
       </w:r>
     </w:p>
     <w:p>
@@ -841,13 +546,13 @@
       </w:pPr>
     </w:p>
     <w:p>
-      <w:proofErr w:type="spellStart"/>
-      <w:r>
-        <w:t>ImpresoraEtiArt</w:t>
-      </w:r>
-      <w:proofErr w:type="spellEnd"/>
-      <w:r>
-        <w:t xml:space="preserve"> = Impresora para las etiquetas</w:t>
+      <w:r>
+        <w:t>ImpresoraEtiArt = Impresora para las etiquetas</w:t>
+      </w:r>
+    </w:p>
+    <w:p>
+      <w:r>
+        <w:t>Etiqueta = Etiqueta por defecto para la impresion</w:t>
       </w:r>
     </w:p>
     <w:p>
@@ -855,7 +560,6 @@
         <w:pStyle w:val="Ttulo1"/>
       </w:pPr>
       <w:r>
-        <w:lastRenderedPageBreak/>
         <w:t>FUNCIONAMIENTO DE LA APLICACIÓN</w:t>
       </w:r>
     </w:p>
@@ -884,6 +588,9 @@
     </w:p>
     <w:p>
       <w:r>
+        <w:rPr>
+          <w:noProof/>
+        </w:rPr>
         <w:drawing>
           <wp:inline distT="0" distB="0" distL="0" distR="0" wp14:anchorId="78C64940" wp14:editId="50BB5CBA">
             <wp:extent cx="6120765" cy="3451860"/>
@@ -923,17 +630,14 @@
     </w:p>
     <w:p>
       <w:r>
-        <w:t xml:space="preserve">El lote </w:t>
-      </w:r>
-      <w:r>
-        <w:t xml:space="preserve">de los productos terminados </w:t>
-      </w:r>
-      <w:r>
-        <w:t>se indicará en el parametrizable 3 de la cabecera de la regularización.</w:t>
-      </w:r>
-    </w:p>
-    <w:p>
-      <w:r>
+        <w:t>El lote de los productos terminados se indicará en el parametrizable 3 de la cabecera de la regularización.</w:t>
+      </w:r>
+    </w:p>
+    <w:p>
+      <w:r>
+        <w:rPr>
+          <w:noProof/>
+        </w:rPr>
         <w:lastRenderedPageBreak/>
         <w:drawing>
           <wp:inline distT="0" distB="0" distL="0" distR="0" wp14:anchorId="460523E6" wp14:editId="445A57D5">
@@ -1009,6 +713,9 @@
     </w:p>
     <w:p>
       <w:r>
+        <w:rPr>
+          <w:noProof/>
+        </w:rPr>
         <w:drawing>
           <wp:inline distT="0" distB="0" distL="0" distR="0" wp14:anchorId="03E9040B" wp14:editId="1D4CCB3A">
             <wp:extent cx="4663844" cy="2324301"/>
@@ -1052,20 +759,15 @@
         <w:t>En la pantalla de campos externos indicaremos, para cada persona dada de alta que vaya a acceder al módulo, el usuario y la clave con la que accederá.</w:t>
       </w:r>
     </w:p>
+    <w:p>
+      <w:pPr>
+        <w:pStyle w:val="Ttulo2"/>
+      </w:pPr>
+      <w:r>
+        <w:t>Alta de basculas</w:t>
+      </w:r>
+    </w:p>
     <w:p/>
-    <w:p/>
-    <w:p/>
-    <w:p/>
-    <w:p/>
-    <w:p>
-      <w:pPr>
-        <w:pStyle w:val="Ttulo2"/>
-      </w:pPr>
-      <w:r>
-        <w:t>Alta de basculas</w:t>
-      </w:r>
-    </w:p>
-    <w:p/>
     <w:p>
       <w:r>
         <w:t>Las básculas se darán de alta desde las tablas adicionales de A3erp</w:t>
@@ -1073,6 +775,9 @@
     </w:p>
     <w:p>
       <w:r>
+        <w:rPr>
+          <w:noProof/>
+        </w:rPr>
         <w:drawing>
           <wp:inline distT="0" distB="0" distL="0" distR="0" wp14:anchorId="6213A5F3" wp14:editId="713264F2">
             <wp:extent cx="6120765" cy="3247390"/>
@@ -1110,12 +815,339 @@
         </w:drawing>
       </w:r>
     </w:p>
+    <w:p>
+      <w:pPr>
+        <w:pStyle w:val="Ttulo2"/>
+      </w:pPr>
+      <w:r>
+        <w:t>Alta de tipos de articulo</w:t>
+      </w:r>
+    </w:p>
+    <w:p>
+      <w:r>
+        <w:t>Los tipos de articulo se darán de alta desde las tablas adicionales de A3erp</w:t>
+      </w:r>
+    </w:p>
+    <w:p>
+      <w:r>
+        <w:rPr>
+          <w:noProof/>
+        </w:rPr>
+        <w:drawing>
+          <wp:inline distT="0" distB="0" distL="0" distR="0" wp14:anchorId="6AB0C7A7" wp14:editId="1AE8474F">
+            <wp:extent cx="5143946" cy="1928027"/>
+            <wp:effectExtent l="0" t="0" r="0" b="0"/>
+            <wp:docPr id="1915362698" name="Imagen 1"/>
+            <wp:cNvGraphicFramePr>
+              <a:graphicFrameLocks xmlns:a="http://schemas.openxmlformats.org/drawingml/2006/main" noChangeAspect="1"/>
+            </wp:cNvGraphicFramePr>
+            <a:graphic xmlns:a="http://schemas.openxmlformats.org/drawingml/2006/main">
+              <a:graphicData uri="http://schemas.openxmlformats.org/drawingml/2006/picture">
+                <pic:pic xmlns:pic="http://schemas.openxmlformats.org/drawingml/2006/picture">
+                  <pic:nvPicPr>
+                    <pic:cNvPr id="1915362698" name=""/>
+                    <pic:cNvPicPr/>
+                  </pic:nvPicPr>
+                  <pic:blipFill>
+                    <a:blip r:embed="rId11"/>
+                    <a:stretch>
+                      <a:fillRect/>
+                    </a:stretch>
+                  </pic:blipFill>
+                  <pic:spPr>
+                    <a:xfrm>
+                      <a:off x="0" y="0"/>
+                      <a:ext cx="5143946" cy="1928027"/>
+                    </a:xfrm>
+                    <a:prstGeom prst="rect">
+                      <a:avLst/>
+                    </a:prstGeom>
+                  </pic:spPr>
+                </pic:pic>
+              </a:graphicData>
+            </a:graphic>
+          </wp:inline>
+        </w:drawing>
+      </w:r>
+    </w:p>
+    <w:p>
+      <w:pPr>
+        <w:pStyle w:val="Ttulo2"/>
+        <w:ind w:left="708" w:hanging="708"/>
+      </w:pPr>
+    </w:p>
     <w:p/>
+    <w:p/>
     <w:p>
       <w:pPr>
         <w:pStyle w:val="Ttulo2"/>
       </w:pPr>
       <w:r>
+        <w:lastRenderedPageBreak/>
+        <w:t>Configuración de etiquetas</w:t>
+      </w:r>
+    </w:p>
+    <w:p>
+      <w:r>
+        <w:t xml:space="preserve">Los formatos de etiquetas se crearán desde el módulo con el botón </w:t>
+      </w:r>
+      <w:r>
+        <w:drawing>
+          <wp:inline distT="0" distB="0" distL="0" distR="0" wp14:anchorId="027D5350" wp14:editId="1CF1D25F">
+            <wp:extent cx="381033" cy="358171"/>
+            <wp:effectExtent l="0" t="0" r="0" b="3810"/>
+            <wp:docPr id="1095365865" name="Imagen 1"/>
+            <wp:cNvGraphicFramePr>
+              <a:graphicFrameLocks xmlns:a="http://schemas.openxmlformats.org/drawingml/2006/main" noChangeAspect="1"/>
+            </wp:cNvGraphicFramePr>
+            <a:graphic xmlns:a="http://schemas.openxmlformats.org/drawingml/2006/main">
+              <a:graphicData uri="http://schemas.openxmlformats.org/drawingml/2006/picture">
+                <pic:pic xmlns:pic="http://schemas.openxmlformats.org/drawingml/2006/picture">
+                  <pic:nvPicPr>
+                    <pic:cNvPr id="1095365865" name=""/>
+                    <pic:cNvPicPr/>
+                  </pic:nvPicPr>
+                  <pic:blipFill>
+                    <a:blip r:embed="rId12"/>
+                    <a:stretch>
+                      <a:fillRect/>
+                    </a:stretch>
+                  </pic:blipFill>
+                  <pic:spPr>
+                    <a:xfrm>
+                      <a:off x="0" y="0"/>
+                      <a:ext cx="381033" cy="358171"/>
+                    </a:xfrm>
+                    <a:prstGeom prst="rect">
+                      <a:avLst/>
+                    </a:prstGeom>
+                  </pic:spPr>
+                </pic:pic>
+              </a:graphicData>
+            </a:graphic>
+          </wp:inline>
+        </w:drawing>
+      </w:r>
+      <w:r>
+        <w:t>, pero hay que dar de alta estas etiquetas creadas en A3erp en las Tablas adicionales.</w:t>
+      </w:r>
+    </w:p>
+    <w:p>
+      <w:r>
+        <w:drawing>
+          <wp:inline distT="0" distB="0" distL="0" distR="0" wp14:anchorId="61B34479" wp14:editId="3F471BA6">
+            <wp:extent cx="4881093" cy="2151651"/>
+            <wp:effectExtent l="0" t="0" r="0" b="1270"/>
+            <wp:docPr id="1559604340" name="Imagen 1"/>
+            <wp:cNvGraphicFramePr>
+              <a:graphicFrameLocks xmlns:a="http://schemas.openxmlformats.org/drawingml/2006/main" noChangeAspect="1"/>
+            </wp:cNvGraphicFramePr>
+            <a:graphic xmlns:a="http://schemas.openxmlformats.org/drawingml/2006/main">
+              <a:graphicData uri="http://schemas.openxmlformats.org/drawingml/2006/picture">
+                <pic:pic xmlns:pic="http://schemas.openxmlformats.org/drawingml/2006/picture">
+                  <pic:nvPicPr>
+                    <pic:cNvPr id="1559604340" name=""/>
+                    <pic:cNvPicPr/>
+                  </pic:nvPicPr>
+                  <pic:blipFill>
+                    <a:blip r:embed="rId13"/>
+                    <a:stretch>
+                      <a:fillRect/>
+                    </a:stretch>
+                  </pic:blipFill>
+                  <pic:spPr>
+                    <a:xfrm>
+                      <a:off x="0" y="0"/>
+                      <a:ext cx="4894209" cy="2157433"/>
+                    </a:xfrm>
+                    <a:prstGeom prst="rect">
+                      <a:avLst/>
+                    </a:prstGeom>
+                  </pic:spPr>
+                </pic:pic>
+              </a:graphicData>
+            </a:graphic>
+          </wp:inline>
+        </w:drawing>
+      </w:r>
+    </w:p>
+    <w:p>
+      <w:r>
+        <w:t>Para cada formato fr3 creado debeos darle un código de etiqueta y una descripción para diferenciarlo.</w:t>
+      </w:r>
+    </w:p>
+    <w:p>
+      <w:r>
+        <w:t>Podemos tener definidos formatos de etiqueta por cliente, por articulo o por cliente/articulo.</w:t>
+      </w:r>
+    </w:p>
+    <w:p>
+      <w:pPr>
+        <w:rPr>
+          <w:rStyle w:val="nfasisintenso"/>
+        </w:rPr>
+      </w:pPr>
+      <w:r>
+        <w:rPr>
+          <w:rStyle w:val="nfasisintenso"/>
+        </w:rPr>
+        <w:t>Etiqueta por articulo</w:t>
+      </w:r>
+    </w:p>
+    <w:p>
+      <w:r>
+        <w:t>Para asignar una etiqueta en concreto a un artículo, lo haremos en los campos externos de la ficha del artículo.</w:t>
+      </w:r>
+    </w:p>
+    <w:p>
+      <w:pPr>
+        <w:rPr>
+          <w:color w:val="4F81BD" w:themeColor="accent1"/>
+        </w:rPr>
+      </w:pPr>
+      <w:r>
+        <w:rPr>
+          <w:color w:val="4F81BD" w:themeColor="accent1"/>
+        </w:rPr>
+        <w:drawing>
+          <wp:inline distT="0" distB="0" distL="0" distR="0" wp14:anchorId="5969F152" wp14:editId="0535DD01">
+            <wp:extent cx="6120765" cy="1236345"/>
+            <wp:effectExtent l="0" t="0" r="0" b="1905"/>
+            <wp:docPr id="964849248" name="Imagen 1"/>
+            <wp:cNvGraphicFramePr>
+              <a:graphicFrameLocks xmlns:a="http://schemas.openxmlformats.org/drawingml/2006/main" noChangeAspect="1"/>
+            </wp:cNvGraphicFramePr>
+            <a:graphic xmlns:a="http://schemas.openxmlformats.org/drawingml/2006/main">
+              <a:graphicData uri="http://schemas.openxmlformats.org/drawingml/2006/picture">
+                <pic:pic xmlns:pic="http://schemas.openxmlformats.org/drawingml/2006/picture">
+                  <pic:nvPicPr>
+                    <pic:cNvPr id="964849248" name=""/>
+                    <pic:cNvPicPr/>
+                  </pic:nvPicPr>
+                  <pic:blipFill>
+                    <a:blip r:embed="rId14"/>
+                    <a:stretch>
+                      <a:fillRect/>
+                    </a:stretch>
+                  </pic:blipFill>
+                  <pic:spPr>
+                    <a:xfrm>
+                      <a:off x="0" y="0"/>
+                      <a:ext cx="6120765" cy="1236345"/>
+                    </a:xfrm>
+                    <a:prstGeom prst="rect">
+                      <a:avLst/>
+                    </a:prstGeom>
+                  </pic:spPr>
+                </pic:pic>
+              </a:graphicData>
+            </a:graphic>
+          </wp:inline>
+        </w:drawing>
+      </w:r>
+    </w:p>
+    <w:p>
+      <w:r>
+        <w:rPr>
+          <w:rStyle w:val="nfasisintenso"/>
+        </w:rPr>
+        <w:t>Etiqueta por cliente</w:t>
+      </w:r>
+    </w:p>
+    <w:p>
+      <w:r>
+        <w:t xml:space="preserve">Para </w:t>
+      </w:r>
+      <w:r>
+        <w:t xml:space="preserve">asignar una etiqueta en concreto a un cliente o a un articulo de un cliente, lo haremos en la pestaña de </w:t>
+      </w:r>
+      <w:r>
+        <w:rPr>
+          <w:i/>
+          <w:iCs/>
+        </w:rPr>
+        <w:t>Etiquetas cliente articulo</w:t>
+      </w:r>
+      <w:r>
+        <w:t xml:space="preserve"> de la ficha del cliente.</w:t>
+      </w:r>
+    </w:p>
+    <w:p>
+      <w:r>
+        <w:lastRenderedPageBreak/>
+        <w:drawing>
+          <wp:inline distT="0" distB="0" distL="0" distR="0" wp14:anchorId="1FBA0C2B" wp14:editId="00F1E98E">
+            <wp:extent cx="6120765" cy="1670050"/>
+            <wp:effectExtent l="0" t="0" r="0" b="6350"/>
+            <wp:docPr id="234591380" name="Imagen 1"/>
+            <wp:cNvGraphicFramePr>
+              <a:graphicFrameLocks xmlns:a="http://schemas.openxmlformats.org/drawingml/2006/main" noChangeAspect="1"/>
+            </wp:cNvGraphicFramePr>
+            <a:graphic xmlns:a="http://schemas.openxmlformats.org/drawingml/2006/main">
+              <a:graphicData uri="http://schemas.openxmlformats.org/drawingml/2006/picture">
+                <pic:pic xmlns:pic="http://schemas.openxmlformats.org/drawingml/2006/picture">
+                  <pic:nvPicPr>
+                    <pic:cNvPr id="234591380" name=""/>
+                    <pic:cNvPicPr/>
+                  </pic:nvPicPr>
+                  <pic:blipFill>
+                    <a:blip r:embed="rId15"/>
+                    <a:stretch>
+                      <a:fillRect/>
+                    </a:stretch>
+                  </pic:blipFill>
+                  <pic:spPr>
+                    <a:xfrm>
+                      <a:off x="0" y="0"/>
+                      <a:ext cx="6120765" cy="1670050"/>
+                    </a:xfrm>
+                    <a:prstGeom prst="rect">
+                      <a:avLst/>
+                    </a:prstGeom>
+                  </pic:spPr>
+                </pic:pic>
+              </a:graphicData>
+            </a:graphic>
+          </wp:inline>
+        </w:drawing>
+      </w:r>
+    </w:p>
+    <w:p>
+      <w:r>
+        <w:t>Si dejamos el campo articulo en blanco, lo toma como la etiqueta del cliente.</w:t>
+      </w:r>
+    </w:p>
+    <w:p>
+      <w:pPr>
+        <w:pStyle w:val="Ttulo2"/>
+        <w:ind w:left="708" w:hanging="708"/>
+      </w:pPr>
+    </w:p>
+    <w:p>
+      <w:pPr>
+        <w:pStyle w:val="Ttulo2"/>
+        <w:ind w:left="708" w:hanging="708"/>
+      </w:pPr>
+      <w:r>
+        <w:t>Datos de los artículos para las etiquetas</w:t>
+      </w:r>
+    </w:p>
+    <w:p>
+      <w:r>
+        <w:t>Los datos a mostrar en la etiqueta que están relacionados con el artículo, se indicaran en los campos externos del articulo.</w:t>
+      </w:r>
+    </w:p>
+    <w:p>
+      <w:r>
+        <w:t>Si queremos personalizar estos datos por cliente/articulo, los indicaremos en la referencia del articulo para ese cliente.</w:t>
+      </w:r>
+    </w:p>
+    <w:p/>
+    <w:p>
+      <w:pPr>
+        <w:pStyle w:val="Ttulo2"/>
+      </w:pPr>
+      <w:r>
         <w:t>Trabajo en el módulo</w:t>
       </w:r>
     </w:p>
@@ -1127,7 +1159,9 @@
     </w:p>
     <w:p>
       <w:r>
-        <w:lastRenderedPageBreak/>
+        <w:rPr>
+          <w:noProof/>
+        </w:rPr>
         <w:drawing>
           <wp:inline distT="0" distB="0" distL="0" distR="0" wp14:anchorId="6ACDD5D8" wp14:editId="000EDEEC">
             <wp:extent cx="3276600" cy="2677282"/>
@@ -1144,7 +1178,7 @@
                     <pic:cNvPicPr/>
                   </pic:nvPicPr>
                   <pic:blipFill>
-                    <a:blip r:embed="rId11"/>
+                    <a:blip r:embed="rId16"/>
                     <a:stretch>
                       <a:fillRect/>
                     </a:stretch>
@@ -1172,16 +1206,17 @@
     </w:p>
     <w:p>
       <w:r>
+        <w:lastRenderedPageBreak/>
         <w:t>Una vez identificados, nos permitirá trabajar con el módulo. La pantalla será la siguiente:</w:t>
       </w:r>
     </w:p>
     <w:p>
       <w:r>
         <w:drawing>
-          <wp:inline distT="0" distB="0" distL="0" distR="0" wp14:anchorId="1B6EE5B2" wp14:editId="42B5BF7C">
-            <wp:extent cx="6120765" cy="4129405"/>
-            <wp:effectExtent l="0" t="0" r="0" b="4445"/>
-            <wp:docPr id="967459522" name="Imagen 1"/>
+          <wp:inline distT="0" distB="0" distL="0" distR="0" wp14:anchorId="62D9D0E0" wp14:editId="08342A73">
+            <wp:extent cx="6120765" cy="3432175"/>
+            <wp:effectExtent l="0" t="0" r="0" b="0"/>
+            <wp:docPr id="110154391" name="Imagen 1"/>
             <wp:cNvGraphicFramePr>
               <a:graphicFrameLocks xmlns:a="http://schemas.openxmlformats.org/drawingml/2006/main" noChangeAspect="1"/>
             </wp:cNvGraphicFramePr>
@@ -1189,11 +1224,11 @@
               <a:graphicData uri="http://schemas.openxmlformats.org/drawingml/2006/picture">
                 <pic:pic xmlns:pic="http://schemas.openxmlformats.org/drawingml/2006/picture">
                   <pic:nvPicPr>
-                    <pic:cNvPr id="967459522" name=""/>
+                    <pic:cNvPr id="110154391" name=""/>
                     <pic:cNvPicPr/>
                   </pic:nvPicPr>
                   <pic:blipFill>
-                    <a:blip r:embed="rId12"/>
+                    <a:blip r:embed="rId17"/>
                     <a:stretch>
                       <a:fillRect/>
                     </a:stretch>
@@ -1201,7 +1236,7 @@
                   <pic:spPr>
                     <a:xfrm>
                       <a:off x="0" y="0"/>
-                      <a:ext cx="6120765" cy="4129405"/>
+                      <a:ext cx="6120765" cy="3432175"/>
                     </a:xfrm>
                     <a:prstGeom prst="rect">
                       <a:avLst/>
@@ -1215,11 +1250,162 @@
       </w:r>
     </w:p>
     <w:p>
+      <w:pPr>
+        <w:rPr>
+          <w:rStyle w:val="nfasisintenso"/>
+        </w:rPr>
+      </w:pPr>
+      <w:r>
+        <w:rPr>
+          <w:rStyle w:val="nfasisintenso"/>
+        </w:rPr>
+        <w:t>Configuración visual de la pantalla</w:t>
+      </w:r>
+    </w:p>
+    <w:p>
+      <w:r>
+        <w:t xml:space="preserve">En la parte inferior de la pantalla tenemos el botón </w:t>
+      </w:r>
+      <w:r>
+        <w:rPr>
+          <w:b/>
+          <w:bCs/>
+        </w:rPr>
+        <w:t>Teclado</w:t>
+      </w:r>
+      <w:r>
+        <w:t xml:space="preserve"> </w:t>
+      </w:r>
+      <w:r>
+        <w:drawing>
+          <wp:inline distT="0" distB="0" distL="0" distR="0" wp14:anchorId="7C03889C" wp14:editId="2E9CD191">
+            <wp:extent cx="403895" cy="358171"/>
+            <wp:effectExtent l="0" t="0" r="0" b="3810"/>
+            <wp:docPr id="1571289545" name="Imagen 1"/>
+            <wp:cNvGraphicFramePr>
+              <a:graphicFrameLocks xmlns:a="http://schemas.openxmlformats.org/drawingml/2006/main" noChangeAspect="1"/>
+            </wp:cNvGraphicFramePr>
+            <a:graphic xmlns:a="http://schemas.openxmlformats.org/drawingml/2006/main">
+              <a:graphicData uri="http://schemas.openxmlformats.org/drawingml/2006/picture">
+                <pic:pic xmlns:pic="http://schemas.openxmlformats.org/drawingml/2006/picture">
+                  <pic:nvPicPr>
+                    <pic:cNvPr id="1571289545" name=""/>
+                    <pic:cNvPicPr/>
+                  </pic:nvPicPr>
+                  <pic:blipFill>
+                    <a:blip r:embed="rId18"/>
+                    <a:stretch>
+                      <a:fillRect/>
+                    </a:stretch>
+                  </pic:blipFill>
+                  <pic:spPr>
+                    <a:xfrm>
+                      <a:off x="0" y="0"/>
+                      <a:ext cx="403895" cy="358171"/>
+                    </a:xfrm>
+                    <a:prstGeom prst="rect">
+                      <a:avLst/>
+                    </a:prstGeom>
+                  </pic:spPr>
+                </pic:pic>
+              </a:graphicData>
+            </a:graphic>
+          </wp:inline>
+        </w:drawing>
+      </w:r>
+      <w:r>
+        <w:t>. Con el podemos levantar u ocultar un teclado táctil.</w:t>
+      </w:r>
+    </w:p>
+    <w:p>
+      <w:r>
+        <w:t>Podemos cambiar el tamaño de los datos de la rejilla pulsando sobre ella y con las teclas ctrl + y ctrl -.</w:t>
+      </w:r>
+    </w:p>
+    <w:p>
+      <w:r>
+        <w:t>Podemos cambiar la distribución de las columnas al orden que queramos.</w:t>
+      </w:r>
+    </w:p>
+    <w:p>
+      <w:r>
+        <w:t xml:space="preserve">Para guardar la configuración realizada, lo haremos con el botón </w:t>
+      </w:r>
+      <w:r>
+        <w:drawing>
+          <wp:inline distT="0" distB="0" distL="0" distR="0" wp14:anchorId="069E87B5" wp14:editId="0AC8D431">
+            <wp:extent cx="472481" cy="381033"/>
+            <wp:effectExtent l="0" t="0" r="3810" b="0"/>
+            <wp:docPr id="55450297" name="Imagen 1"/>
+            <wp:cNvGraphicFramePr>
+              <a:graphicFrameLocks xmlns:a="http://schemas.openxmlformats.org/drawingml/2006/main" noChangeAspect="1"/>
+            </wp:cNvGraphicFramePr>
+            <a:graphic xmlns:a="http://schemas.openxmlformats.org/drawingml/2006/main">
+              <a:graphicData uri="http://schemas.openxmlformats.org/drawingml/2006/picture">
+                <pic:pic xmlns:pic="http://schemas.openxmlformats.org/drawingml/2006/picture">
+                  <pic:nvPicPr>
+                    <pic:cNvPr id="1334261547" name=""/>
+                    <pic:cNvPicPr/>
+                  </pic:nvPicPr>
+                  <pic:blipFill>
+                    <a:blip r:embed="rId19"/>
+                    <a:stretch>
+                      <a:fillRect/>
+                    </a:stretch>
+                  </pic:blipFill>
+                  <pic:spPr>
+                    <a:xfrm>
+                      <a:off x="0" y="0"/>
+                      <a:ext cx="472481" cy="381033"/>
+                    </a:xfrm>
+                    <a:prstGeom prst="rect">
+                      <a:avLst/>
+                    </a:prstGeom>
+                  </pic:spPr>
+                </pic:pic>
+              </a:graphicData>
+            </a:graphic>
+          </wp:inline>
+        </w:drawing>
+      </w:r>
+      <w:r>
+        <w:t xml:space="preserve"> de la parte inferior de la pantalla.</w:t>
+      </w:r>
+    </w:p>
+    <w:p>
+      <w:pPr>
+        <w:rPr>
+          <w:rStyle w:val="nfasisintenso"/>
+        </w:rPr>
+      </w:pPr>
+      <w:r>
+        <w:rPr>
+          <w:rStyle w:val="nfasisintenso"/>
+        </w:rPr>
+        <w:t>Funcionamiento</w:t>
+      </w:r>
+    </w:p>
+    <w:p>
       <w:r>
         <w:t xml:space="preserve">En la parte superior de la pantalla </w:t>
       </w:r>
       <w:r>
         <w:t>mostrará la fecha actual y el usuario con el que se ha accedido al módulo.</w:t>
+      </w:r>
+    </w:p>
+    <w:p>
+      <w:r>
+        <w:t xml:space="preserve">Si queremos cambiar el usuario, lo haremos pulsando del botón </w:t>
+      </w:r>
+      <w:r>
+        <w:rPr>
+          <w:b/>
+          <w:bCs/>
+        </w:rPr>
+        <w:t>Usuario:</w:t>
+      </w:r>
+      <w:r>
+        <w:t>.</w:t>
       </w:r>
     </w:p>
     <w:p>
@@ -1237,7 +1423,14 @@
         </w:numPr>
       </w:pPr>
       <w:r>
-        <w:t>Artículo: Artículo que se va a pesar.</w:t>
+        <w:rPr>
+          <w:b/>
+          <w:bCs/>
+        </w:rPr>
+        <w:t>Artículo</w:t>
+      </w:r>
+      <w:r>
+        <w:t>: Artículo que se va a pesar.</w:t>
       </w:r>
     </w:p>
     <w:p>
@@ -1249,7 +1442,14 @@
         </w:numPr>
       </w:pPr>
       <w:r>
-        <w:t xml:space="preserve">Etiqueta: Etiqueta seleccionada para la impresión </w:t>
+        <w:rPr>
+          <w:b/>
+          <w:bCs/>
+        </w:rPr>
+        <w:t>Etiqueta</w:t>
+      </w:r>
+      <w:r>
+        <w:t xml:space="preserve">: Etiqueta seleccionada para la impresión </w:t>
       </w:r>
     </w:p>
     <w:p>
@@ -1261,12 +1461,35 @@
         </w:numPr>
       </w:pPr>
       <w:r>
-        <w:t>Lote: Lote del producto que se va a pesar, que deberá existir en el parametrizable 3 de una regularización.</w:t>
-      </w:r>
-    </w:p>
-    <w:p>
-      <w:r>
-        <w:t xml:space="preserve">El dato Cliente se indicará cuando en la etiqueta necesitemos que para ese cliente el código de barras se tome de la referencia del cliente para ese artículo que estamos pesando, en lugar de el código de barras del </w:t>
+        <w:rPr>
+          <w:b/>
+          <w:bCs/>
+        </w:rPr>
+        <w:t>Lote</w:t>
+      </w:r>
+      <w:r>
+        <w:t>: Lote del producto que se va a pesar, que deberá existir en el parametrizable 3 de una regularización.</w:t>
+      </w:r>
+    </w:p>
+    <w:p>
+      <w:r>
+        <w:t xml:space="preserve">El dato </w:t>
+      </w:r>
+      <w:r>
+        <w:rPr>
+          <w:b/>
+          <w:bCs/>
+        </w:rPr>
+        <w:t>Cliente</w:t>
+      </w:r>
+      <w:r>
+        <w:t xml:space="preserve"> se indicará cuando en la etiqueta necesitemos que para ese cliente el código de barras se tome de la referencia del cliente para ese artículo que estamos pesando, en lugar </w:t>
+      </w:r>
+      <w:r>
+        <w:t>del</w:t>
+      </w:r>
+      <w:r>
+        <w:t xml:space="preserve"> código de barras del </w:t>
       </w:r>
       <w:r>
         <w:t>artículo</w:t>
@@ -1277,7 +1500,116 @@
     </w:p>
     <w:p>
       <w:r>
-        <w:t>En el desplegable seleccionaremos que pesadas de las almacenadas queremos que nos muestre.</w:t>
+        <w:t>Por defecto, la etiqueta que saldrá seleccionada será la que le hayamos indicado en el config.ini.</w:t>
+      </w:r>
+    </w:p>
+    <w:p>
+      <w:r>
+        <w:t>En el momento que le indiquemos un cliente o un artículo, buscará si existe etiqueta personalizada para ese cliente y/o articulo y la cargará como etiqueta.</w:t>
+      </w:r>
+    </w:p>
+    <w:p>
+      <w:pPr>
+        <w:rPr>
+          <w:b/>
+          <w:bCs/>
+        </w:rPr>
+      </w:pPr>
+      <w:r>
+        <w:t xml:space="preserve">La etiqueta se puede cambiar pulsando el botón </w:t>
+      </w:r>
+      <w:r>
+        <w:rPr>
+          <w:b/>
+          <w:bCs/>
+        </w:rPr>
+        <w:t>Etiqueta.</w:t>
+      </w:r>
+    </w:p>
+    <w:p>
+      <w:r>
+        <w:t xml:space="preserve">En este caso, los datos de la etiqueta que se encuentran en la ficha del artículo, si tienen valor en la referencia del cliente, se tomarán de esa referencia, </w:t>
+      </w:r>
+      <w:r>
+        <w:t>si no</w:t>
+      </w:r>
+      <w:r>
+        <w:t>, se dejarán los del artículo.</w:t>
+      </w:r>
+    </w:p>
+    <w:p>
+      <w:pPr>
+        <w:rPr>
+          <w:i/>
+          <w:iCs/>
+        </w:rPr>
+      </w:pPr>
+      <w:r>
+        <w:t xml:space="preserve">Podemos realizar la búsqueda de clientes, artículos o etiquetas pulsando sobre los botones </w:t>
+      </w:r>
+      <w:r>
+        <w:rPr>
+          <w:b/>
+          <w:bCs/>
+          <w:i/>
+          <w:iCs/>
+        </w:rPr>
+        <w:t>Cliente:, Artículo o Etiqueta</w:t>
+      </w:r>
+      <w:r>
+        <w:rPr>
+          <w:i/>
+          <w:iCs/>
+        </w:rPr>
+        <w:t xml:space="preserve"> respectivamente.</w:t>
+      </w:r>
+    </w:p>
+    <w:p>
+      <w:r>
+        <w:t xml:space="preserve">En el desplegable </w:t>
+      </w:r>
+      <w:r>
+        <w:drawing>
+          <wp:inline distT="0" distB="0" distL="0" distR="0" wp14:anchorId="1777DF72" wp14:editId="416AF230">
+            <wp:extent cx="1244958" cy="257111"/>
+            <wp:effectExtent l="0" t="0" r="0" b="0"/>
+            <wp:docPr id="1725922031" name="Imagen 1"/>
+            <wp:cNvGraphicFramePr>
+              <a:graphicFrameLocks xmlns:a="http://schemas.openxmlformats.org/drawingml/2006/main" noChangeAspect="1"/>
+            </wp:cNvGraphicFramePr>
+            <a:graphic xmlns:a="http://schemas.openxmlformats.org/drawingml/2006/main">
+              <a:graphicData uri="http://schemas.openxmlformats.org/drawingml/2006/picture">
+                <pic:pic xmlns:pic="http://schemas.openxmlformats.org/drawingml/2006/picture">
+                  <pic:nvPicPr>
+                    <pic:cNvPr id="1725922031" name=""/>
+                    <pic:cNvPicPr/>
+                  </pic:nvPicPr>
+                  <pic:blipFill>
+                    <a:blip r:embed="rId20"/>
+                    <a:stretch>
+                      <a:fillRect/>
+                    </a:stretch>
+                  </pic:blipFill>
+                  <pic:spPr>
+                    <a:xfrm>
+                      <a:off x="0" y="0"/>
+                      <a:ext cx="1272780" cy="262857"/>
+                    </a:xfrm>
+                    <a:prstGeom prst="rect">
+                      <a:avLst/>
+                    </a:prstGeom>
+                  </pic:spPr>
+                </pic:pic>
+              </a:graphicData>
+            </a:graphic>
+          </wp:inline>
+        </w:drawing>
+      </w:r>
+      <w:r>
+        <w:t xml:space="preserve"> </w:t>
+      </w:r>
+      <w:r>
+        <w:t>seleccionaremos que pesadas de las almacenadas queremos que nos muestre.</w:t>
       </w:r>
     </w:p>
     <w:p>
@@ -1297,15 +1629,7 @@
     </w:p>
     <w:p>
       <w:r>
-        <w:t xml:space="preserve">Con el </w:t>
-      </w:r>
-      <w:proofErr w:type="spellStart"/>
-      <w:r>
-        <w:t>check</w:t>
-      </w:r>
-      <w:proofErr w:type="spellEnd"/>
-      <w:r>
-        <w:t xml:space="preserve"> </w:t>
+        <w:t xml:space="preserve">Con el check </w:t>
       </w:r>
       <w:r>
         <w:rPr>
@@ -1325,6 +1649,15 @@
       </w:r>
     </w:p>
     <w:p>
+      <w:r>
+        <w:t xml:space="preserve">Al insertar un lote se comprobará que los dos primeros caracteres de ese lote se corresponden con algunos de los tipos de los artículos y se mostrará un mensaje </w:t>
+      </w:r>
+      <w:r>
+        <w:lastRenderedPageBreak/>
+        <w:t>indicando que tipo de articulo es y si no se corresponde, se indicará que no pertenece a ningún tipo de artículo.</w:t>
+      </w:r>
+    </w:p>
+    <w:p>
       <w:pPr>
         <w:pStyle w:val="Ttulo2"/>
       </w:pPr>
@@ -1391,6 +1724,9 @@
     </w:p>
     <w:p>
       <w:r>
+        <w:rPr>
+          <w:noProof/>
+        </w:rPr>
         <w:drawing>
           <wp:inline distT="0" distB="0" distL="0" distR="0" wp14:anchorId="504E3D5D" wp14:editId="6495007C">
             <wp:extent cx="2301439" cy="685859"/>
@@ -1407,7 +1743,7 @@
                     <pic:cNvPicPr/>
                   </pic:nvPicPr>
                   <pic:blipFill>
-                    <a:blip r:embed="rId13"/>
+                    <a:blip r:embed="rId21"/>
                     <a:stretch>
                       <a:fillRect/>
                     </a:stretch>
@@ -1436,7 +1772,6 @@
         </w:rPr>
       </w:pPr>
       <w:r>
-        <w:lastRenderedPageBreak/>
         <w:t xml:space="preserve">Insertaremos el peso en el campo y pulsaremos el botón </w:t>
       </w:r>
       <w:r>
@@ -1461,13 +1796,11 @@
       <w:r>
         <w:t xml:space="preserve"> y si </w:t>
       </w:r>
-      <w:proofErr w:type="spellStart"/>
-      <w:r>
-        <w:t>lla</w:t>
-      </w:r>
-      <w:proofErr w:type="spellEnd"/>
-      <w:r>
-        <w:t xml:space="preserve"> está regularizada o no con el campo </w:t>
+      <w:r>
+        <w:t>y</w:t>
+      </w:r>
+      <w:r>
+        <w:t xml:space="preserve">a está regularizada o no con el campo </w:t>
       </w:r>
       <w:r>
         <w:rPr>
@@ -1480,6 +1813,7 @@
         <w:t xml:space="preserve"> (el cual tendrá indicado el código interno de la regularización).</w:t>
       </w:r>
     </w:p>
+    <w:p/>
     <w:p>
       <w:pPr>
         <w:pStyle w:val="Ttulo2"/>
@@ -1528,6 +1862,7 @@
         </w:rPr>
       </w:pPr>
       <w:r>
+        <w:lastRenderedPageBreak/>
         <w:t xml:space="preserve">Para enviar las pesadas a su regularización correspondiente (aquella que contenga en su param3 el lote indicado en la pantalla), seleccionaremos las pesadas que queramos regularizar y pulsaremos el botón </w:t>
       </w:r>
       <w:r>
@@ -1558,6 +1893,9 @@
     </w:p>
     <w:p>
       <w:r>
+        <w:rPr>
+          <w:noProof/>
+        </w:rPr>
         <w:drawing>
           <wp:inline distT="0" distB="0" distL="0" distR="0" wp14:anchorId="4D54DDA9" wp14:editId="4BC86B55">
             <wp:extent cx="3528366" cy="1181202"/>
@@ -1574,7 +1912,7 @@
                     <pic:cNvPicPr/>
                   </pic:nvPicPr>
                   <pic:blipFill>
-                    <a:blip r:embed="rId14"/>
+                    <a:blip r:embed="rId22"/>
                     <a:stretch>
                       <a:fillRect/>
                     </a:stretch>
@@ -1605,7 +1943,9 @@
     </w:p>
     <w:p>
       <w:r>
-        <w:lastRenderedPageBreak/>
+        <w:rPr>
+          <w:noProof/>
+        </w:rPr>
         <w:drawing>
           <wp:inline distT="0" distB="0" distL="0" distR="0" wp14:anchorId="396A5AB5" wp14:editId="68885BF2">
             <wp:extent cx="6120765" cy="1998980"/>
@@ -1622,7 +1962,7 @@
                     <pic:cNvPicPr/>
                   </pic:nvPicPr>
                   <pic:blipFill>
-                    <a:blip r:embed="rId15"/>
+                    <a:blip r:embed="rId23"/>
                     <a:stretch>
                       <a:fillRect/>
                     </a:stretch>
@@ -1658,6 +1998,9 @@
     </w:p>
     <w:p>
       <w:r>
+        <w:rPr>
+          <w:noProof/>
+        </w:rPr>
         <w:drawing>
           <wp:inline distT="0" distB="0" distL="0" distR="0" wp14:anchorId="78703389" wp14:editId="03760D8D">
             <wp:extent cx="6035563" cy="1348857"/>
@@ -1674,7 +2017,7 @@
                     <pic:cNvPicPr/>
                   </pic:nvPicPr>
                   <pic:blipFill>
-                    <a:blip r:embed="rId16"/>
+                    <a:blip r:embed="rId24"/>
                     <a:stretch>
                       <a:fillRect/>
                     </a:stretch>
@@ -1697,20 +2040,13 @@
     </w:p>
     <w:p>
       <w:r>
+        <w:lastRenderedPageBreak/>
         <w:t>Hay que tener en cuenta que este proceso es irreversible. Aunque luego cancelemos los cambios, lo indicado aquí ya no se recupera.</w:t>
       </w:r>
     </w:p>
     <w:p>
       <w:r>
-        <w:t xml:space="preserve">Si indicamos que </w:t>
-      </w:r>
-      <w:proofErr w:type="spellStart"/>
-      <w:r>
-        <w:t>si</w:t>
-      </w:r>
-      <w:proofErr w:type="spellEnd"/>
-      <w:r>
-        <w:t>, la relación de las líneas de pesadas asociadas a la línea se eliminará y las pesadas volverán a quedar pendientes de regularizar.</w:t>
+        <w:t>Si indicamos que si, la relación de las líneas de pesadas asociadas a la línea se eliminará y las pesadas volverán a quedar pendientes de regularizar.</w:t>
       </w:r>
     </w:p>
     <w:p>
@@ -1733,6 +2069,9 @@
     </w:p>
     <w:p>
       <w:r>
+        <w:rPr>
+          <w:noProof/>
+        </w:rPr>
         <w:drawing>
           <wp:inline distT="0" distB="0" distL="0" distR="0" wp14:anchorId="74D5EA16" wp14:editId="4D8231DF">
             <wp:extent cx="624894" cy="541067"/>
@@ -1749,7 +2088,7 @@
                     <pic:cNvPicPr/>
                   </pic:nvPicPr>
                   <pic:blipFill>
-                    <a:blip r:embed="rId17"/>
+                    <a:blip r:embed="rId25"/>
                     <a:stretch>
                       <a:fillRect/>
                     </a:stretch>
@@ -1777,25 +2116,19 @@
     </w:p>
     <w:p>
       <w:r>
-        <w:t xml:space="preserve">Cuando creemos una etiqueta nueva, debemos crear su relación en A3erp para que luego se nos muestre en el desplegable del </w:t>
-      </w:r>
-      <w:proofErr w:type="spellStart"/>
-      <w:r>
-        <w:t>modulo</w:t>
-      </w:r>
-      <w:proofErr w:type="spellEnd"/>
-      <w:r>
-        <w:t>.</w:t>
-      </w:r>
-    </w:p>
-    <w:p>
-      <w:r>
-        <w:lastRenderedPageBreak/>
+        <w:t>Cuando creemos una etiqueta nueva, debemos crear su relación en A3erp para que luego se nos muestre en el desplegable del modulo.</w:t>
+      </w:r>
+    </w:p>
+    <w:p>
+      <w:r>
         <w:t>Esto lo haremos desde la opción de tablas adicionales</w:t>
       </w:r>
     </w:p>
     <w:p>
       <w:r>
+        <w:rPr>
+          <w:noProof/>
+        </w:rPr>
         <w:drawing>
           <wp:inline distT="0" distB="0" distL="0" distR="0" wp14:anchorId="7A6CA2A6" wp14:editId="4CAEF4C7">
             <wp:extent cx="6120765" cy="3298190"/>
@@ -1812,7 +2145,7 @@
                     <pic:cNvPicPr/>
                   </pic:nvPicPr>
                   <pic:blipFill>
-                    <a:blip r:embed="rId18"/>
+                    <a:blip r:embed="rId26"/>
                     <a:stretch>
                       <a:fillRect/>
                     </a:stretch>
@@ -1850,8 +2183,8 @@
     <w:p/>
     <w:p/>
     <w:sectPr>
-      <w:headerReference w:type="default" r:id="rId19"/>
-      <w:footerReference w:type="default" r:id="rId20"/>
+      <w:headerReference w:type="default" r:id="rId27"/>
+      <w:footerReference w:type="default" r:id="rId28"/>
       <w:pgSz w:w="11906" w:h="16838"/>
       <w:pgMar w:top="836" w:right="1133" w:bottom="567" w:left="1134" w:header="847" w:footer="431" w:gutter="0"/>
       <w:cols w:space="708"/>
@@ -2124,7 +2457,7 @@
       <w:t xml:space="preserve"> Fecha de Redacción </w:t>
     </w:r>
     <w:r>
-      <w:t>10</w:t>
+      <w:t>30</w:t>
     </w:r>
     <w:r>
       <w:t>/</w:t>
@@ -7165,7 +7498,6 @@
   <w:style w:type="character" w:default="1" w:styleId="Fuentedeprrafopredeter">
     <w:name w:val="Default Paragraph Font"/>
     <w:uiPriority w:val="1"/>
-    <w:semiHidden/>
     <w:unhideWhenUsed/>
   </w:style>
   <w:style w:type="table" w:default="1" w:styleId="Tablanormal">
@@ -7378,6 +7710,18 @@
       <w:color w:val="365F91" w:themeColor="accent1" w:themeShade="BF"/>
       <w:sz w:val="28"/>
       <w:szCs w:val="28"/>
+    </w:rPr>
+  </w:style>
+  <w:style w:type="character" w:styleId="nfasisintenso">
+    <w:name w:val="Intense Emphasis"/>
+    <w:basedOn w:val="Fuentedeprrafopredeter"/>
+    <w:uiPriority w:val="21"/>
+    <w:qFormat/>
+    <w:rsid w:val="00932244"/>
+    <w:rPr>
+      <w:i/>
+      <w:iCs/>
+      <w:color w:val="4F81BD" w:themeColor="accent1"/>
     </w:rPr>
   </w:style>
 </w:styles>

</xml_diff>

<commit_message>
Version 1.2.2 - Ajustes
</commit_message>
<xml_diff>
--- a/Docs/Manual usuario gestor de etiquetas.docx
+++ b/Docs/Manual usuario gestor de etiquetas.docx
@@ -24,7 +24,15 @@
         <w:t>,</w:t>
       </w:r>
       <w:r>
-        <w:t xml:space="preserve"> para generar las fabricaciones utilizan las regularizaciones, en las cuales insertan manualmente los lotes de los productos de materia prima que van usar en negativo. Por ejemplo, insertan las piezas de atún con su lote que van a usar </w:t>
+        <w:t xml:space="preserve"> para generar las fabricaciones utilizan las regularizaciones, en las cuales insertan manualmente los lotes de los productos de materia prima que </w:t>
+      </w:r>
+      <w:proofErr w:type="gramStart"/>
+      <w:r>
+        <w:t>van</w:t>
+      </w:r>
+      <w:proofErr w:type="gramEnd"/>
+      <w:r>
+        <w:t xml:space="preserve"> usar en negativo. Por ejemplo, insertan las piezas de atún con su lote que van a usar </w:t>
       </w:r>
       <w:r>
         <w:t>para generar el despiece.</w:t>
@@ -32,7 +40,15 @@
     </w:p>
     <w:p>
       <w:r>
-        <w:t>Mediante el módulo, indicaremos un artículo a pesar e iremos pesando en la bascula e imprimiendo las etiquetas para los productos pesados.</w:t>
+        <w:t xml:space="preserve">Mediante el módulo, indicaremos un artículo a pesar e iremos pesando en la </w:t>
+      </w:r>
+      <w:proofErr w:type="spellStart"/>
+      <w:r>
+        <w:t>bascula</w:t>
+      </w:r>
+      <w:proofErr w:type="spellEnd"/>
+      <w:r>
+        <w:t xml:space="preserve"> e imprimiendo las etiquetas para los productos pesados.</w:t>
       </w:r>
     </w:p>
     <w:p>
@@ -74,9 +90,11 @@
           <w:numId w:val="39"/>
         </w:numPr>
       </w:pPr>
+      <w:proofErr w:type="spellStart"/>
       <w:r>
         <w:t>GestorEtiquetado</w:t>
       </w:r>
+      <w:proofErr w:type="spellEnd"/>
     </w:p>
     <w:p>
       <w:r>
@@ -112,14 +130,27 @@
       </w:r>
     </w:p>
     <w:p>
-      <w:r>
-        <w:t xml:space="preserve">DllgestorEtiquetado </w:t>
+      <w:proofErr w:type="spellStart"/>
+      <w:r>
+        <w:t>DllgestorEtiquetado</w:t>
+      </w:r>
+      <w:proofErr w:type="spellEnd"/>
+      <w:r>
+        <w:t xml:space="preserve"> </w:t>
       </w:r>
       <w:r>
         <w:sym w:font="Wingdings" w:char="F0E0"/>
       </w:r>
       <w:r>
-        <w:t xml:space="preserve"> Dll de la funcionalidad</w:t>
+        <w:t xml:space="preserve"> </w:t>
+      </w:r>
+      <w:proofErr w:type="spellStart"/>
+      <w:r>
+        <w:t>Dll</w:t>
+      </w:r>
+      <w:proofErr w:type="spellEnd"/>
+      <w:r>
+        <w:t xml:space="preserve"> de la funcionalidad</w:t>
       </w:r>
     </w:p>
     <w:p>
@@ -144,7 +175,15 @@
     <w:p/>
     <w:p>
       <w:r>
-        <w:t>En el archivo de configuración del modulo (config.ini) tenemos los siguientes parámetros:</w:t>
+        <w:t xml:space="preserve">En el archivo de configuración del </w:t>
+      </w:r>
+      <w:proofErr w:type="spellStart"/>
+      <w:r>
+        <w:t>modulo</w:t>
+      </w:r>
+      <w:proofErr w:type="spellEnd"/>
+      <w:r>
+        <w:t xml:space="preserve"> (config.ini) tenemos los siguientes parámetros:</w:t>
       </w:r>
     </w:p>
     <w:tbl>
@@ -162,8 +201,13 @@
             <w:tcW w:w="9629" w:type="dxa"/>
           </w:tcPr>
           <w:p>
+            <w:proofErr w:type="gramStart"/>
             <w:r>
-              <w:t>;Datos para Nexus/A3Erp</w:t>
+              <w:t>;Datos</w:t>
+            </w:r>
+            <w:proofErr w:type="gramEnd"/>
+            <w:r>
+              <w:t xml:space="preserve"> para Nexus/A3Erp</w:t>
             </w:r>
           </w:p>
           <w:p>
@@ -173,61 +217,136 @@
             </w:r>
           </w:p>
           <w:p>
+            <w:proofErr w:type="gramStart"/>
             <w:r>
-              <w:t>;Nombre de la base de datos registrada en SQLServer</w:t>
+              <w:t>;Nombre</w:t>
+            </w:r>
+            <w:proofErr w:type="gramEnd"/>
+            <w:r>
+              <w:t xml:space="preserve"> de la base de datos registrada en </w:t>
+            </w:r>
+            <w:proofErr w:type="spellStart"/>
+            <w:r>
+              <w:t>SQLServer</w:t>
+            </w:r>
+            <w:proofErr w:type="spellEnd"/>
+          </w:p>
+          <w:p>
+            <w:proofErr w:type="gramStart"/>
+            <w:r>
+              <w:t>;*</w:t>
+            </w:r>
+            <w:proofErr w:type="gramEnd"/>
+            <w:r>
+              <w:t>* Parámetro básico de configuración Nexus/A3Erp</w:t>
+            </w:r>
+          </w:p>
+          <w:p>
+            <w:proofErr w:type="spellStart"/>
+            <w:r>
+              <w:t>BaseDatos</w:t>
+            </w:r>
+            <w:proofErr w:type="spellEnd"/>
+            <w:r>
+              <w:t>=</w:t>
+            </w:r>
+            <w:proofErr w:type="spellStart"/>
+            <w:r>
+              <w:t>SalazonesSaez</w:t>
+            </w:r>
+            <w:proofErr w:type="spellEnd"/>
+          </w:p>
+          <w:p/>
+          <w:p>
+            <w:proofErr w:type="gramStart"/>
+            <w:r>
+              <w:t>;Nombre</w:t>
+            </w:r>
+            <w:proofErr w:type="gramEnd"/>
+            <w:r>
+              <w:t xml:space="preserve"> de la empresa registrada en Nexus/A3Erp</w:t>
+            </w:r>
+          </w:p>
+          <w:p>
+            <w:proofErr w:type="gramStart"/>
+            <w:r>
+              <w:t>;*</w:t>
+            </w:r>
+            <w:proofErr w:type="gramEnd"/>
+            <w:r>
+              <w:t>* Parámetro básico de configuración</w:t>
             </w:r>
           </w:p>
           <w:p>
             <w:r>
-              <w:t>;** Parámetro básico de configuración Nexus/A3Erp</w:t>
+              <w:t>Empresa=</w:t>
+            </w:r>
+            <w:proofErr w:type="spellStart"/>
+            <w:r>
+              <w:t>SalazonesSaez</w:t>
+            </w:r>
+            <w:proofErr w:type="spellEnd"/>
+          </w:p>
+          <w:p/>
+          <w:p>
+            <w:proofErr w:type="gramStart"/>
+            <w:r>
+              <w:t>;Contraseña</w:t>
+            </w:r>
+            <w:proofErr w:type="gramEnd"/>
+            <w:r>
+              <w:t xml:space="preserve"> de </w:t>
+            </w:r>
+            <w:proofErr w:type="spellStart"/>
+            <w:r>
+              <w:t>sa</w:t>
+            </w:r>
+            <w:proofErr w:type="spellEnd"/>
+          </w:p>
+          <w:p>
+            <w:proofErr w:type="gramStart"/>
+            <w:r>
+              <w:t>;*</w:t>
+            </w:r>
+            <w:proofErr w:type="gramEnd"/>
+            <w:r>
+              <w:t>* Parámetro básico de configuración con Nexus/A3Erp</w:t>
             </w:r>
           </w:p>
           <w:p>
+            <w:proofErr w:type="spellStart"/>
             <w:r>
-              <w:t>BaseDatos=SalazonesSaez</w:t>
+              <w:t>Password</w:t>
+            </w:r>
+            <w:proofErr w:type="spellEnd"/>
+            <w:r>
+              <w:t>=w6DCocOmw6bDrsW4w6TDiA==</w:t>
             </w:r>
           </w:p>
           <w:p/>
           <w:p>
+            <w:proofErr w:type="gramStart"/>
             <w:r>
-              <w:t>;Nombre de la empresa registrada en Nexus/A3Erp</w:t>
+              <w:t>;Instancia</w:t>
             </w:r>
+            <w:proofErr w:type="gramEnd"/>
+            <w:r>
+              <w:t xml:space="preserve"> del servidor </w:t>
+            </w:r>
+            <w:proofErr w:type="spellStart"/>
+            <w:r>
+              <w:t>SQLSever</w:t>
+            </w:r>
+            <w:proofErr w:type="spellEnd"/>
           </w:p>
           <w:p>
+            <w:proofErr w:type="gramStart"/>
             <w:r>
-              <w:t>;** Parámetro básico de configuración</w:t>
+              <w:t>;*</w:t>
             </w:r>
-          </w:p>
-          <w:p>
+            <w:proofErr w:type="gramEnd"/>
             <w:r>
-              <w:t>Empresa=SalazonesSaez</w:t>
-            </w:r>
-          </w:p>
-          <w:p/>
-          <w:p>
-            <w:r>
-              <w:t>;Contraseña de sa</w:t>
-            </w:r>
-          </w:p>
-          <w:p>
-            <w:r>
-              <w:t>;** Parámetro básico de configuración con Nexus/A3Erp</w:t>
-            </w:r>
-          </w:p>
-          <w:p>
-            <w:r>
-              <w:t>Password=w6DCocOmw6bDrsW4w6TDiA==</w:t>
-            </w:r>
-          </w:p>
-          <w:p/>
-          <w:p>
-            <w:r>
-              <w:t>;Instancia del servidor SQLSever</w:t>
-            </w:r>
-          </w:p>
-          <w:p>
-            <w:r>
-              <w:t>;** Parámetro básico de configuración con Nexus/A3Erp</w:t>
+              <w:t>* Parámetro básico de configuración con Nexus/A3Erp</w:t>
             </w:r>
           </w:p>
           <w:p>
@@ -241,19 +360,34 @@
             </w:r>
           </w:p>
           <w:p>
+            <w:proofErr w:type="spellStart"/>
             <w:r>
-              <w:t>Ip=</w:t>
+              <w:t>Ip</w:t>
+            </w:r>
+            <w:proofErr w:type="spellEnd"/>
+            <w:r>
+              <w:t>=</w:t>
             </w:r>
           </w:p>
           <w:p/>
           <w:p>
+            <w:proofErr w:type="gramStart"/>
             <w:r>
-              <w:t>;Base de datos de sistema de Nexus/A3Erp</w:t>
+              <w:t>;Base</w:t>
+            </w:r>
+            <w:proofErr w:type="gramEnd"/>
+            <w:r>
+              <w:t xml:space="preserve"> de datos de sistema de Nexus/A3Erp</w:t>
             </w:r>
           </w:p>
           <w:p>
+            <w:proofErr w:type="gramStart"/>
             <w:r>
-              <w:t>;** Parámetro básico de configuración Nexus/A3Erp</w:t>
+              <w:t>;*</w:t>
+            </w:r>
+            <w:proofErr w:type="gramEnd"/>
+            <w:r>
+              <w:t>* Parámetro básico de configuración Nexus/A3Erp</w:t>
             </w:r>
           </w:p>
           <w:p>
@@ -263,24 +397,49 @@
           </w:p>
           <w:p/>
           <w:p>
+            <w:proofErr w:type="gramStart"/>
             <w:r>
-              <w:t>;Usuario de SQLServer</w:t>
+              <w:t>;Usuario</w:t>
+            </w:r>
+            <w:proofErr w:type="gramEnd"/>
+            <w:r>
+              <w:t xml:space="preserve"> de </w:t>
+            </w:r>
+            <w:proofErr w:type="spellStart"/>
+            <w:r>
+              <w:t>SQLServer</w:t>
+            </w:r>
+            <w:proofErr w:type="spellEnd"/>
+          </w:p>
+          <w:p>
+            <w:proofErr w:type="gramStart"/>
+            <w:r>
+              <w:t>;*</w:t>
+            </w:r>
+            <w:proofErr w:type="gramEnd"/>
+            <w:r>
+              <w:t>* Parámetro básico de configuración Nexus/A3Erp</w:t>
             </w:r>
           </w:p>
           <w:p>
             <w:r>
-              <w:t>;** Parámetro básico de configuración Nexus/A3Erp</w:t>
+              <w:t>Usuario=</w:t>
             </w:r>
-          </w:p>
-          <w:p>
+            <w:proofErr w:type="spellStart"/>
             <w:r>
-              <w:t>Usuario=sa</w:t>
+              <w:t>sa</w:t>
             </w:r>
+            <w:proofErr w:type="spellEnd"/>
           </w:p>
           <w:p/>
           <w:p>
+            <w:proofErr w:type="spellStart"/>
             <w:r>
-              <w:t>NombreArchivoLog = E:\Repositorios\SalazonesSaez\GestorEtiquetado\Logs\log.txt</w:t>
+              <w:t>NombreArchivoLog</w:t>
+            </w:r>
+            <w:proofErr w:type="spellEnd"/>
+            <w:r>
+              <w:t xml:space="preserve"> = E:\Repositorios\SalazonesSaez\GestorEtiquetado\Logs\log.txt</w:t>
             </w:r>
           </w:p>
           <w:p/>
@@ -290,8 +449,13 @@
             </w:r>
           </w:p>
           <w:p>
+            <w:proofErr w:type="gramStart"/>
             <w:r>
-              <w:t>;Timer espera</w:t>
+              <w:t>;Timer</w:t>
+            </w:r>
+            <w:proofErr w:type="gramEnd"/>
+            <w:r>
+              <w:t xml:space="preserve"> espera</w:t>
             </w:r>
           </w:p>
           <w:p>
@@ -323,9 +487,14 @@
           </w:p>
           <w:p/>
           <w:p>
+            <w:proofErr w:type="gramStart"/>
             <w:r>
               <w:lastRenderedPageBreak/>
-              <w:t>;Almacen para las regularizaciones</w:t>
+              <w:t>;Almacen</w:t>
+            </w:r>
+            <w:proofErr w:type="gramEnd"/>
+            <w:r>
+              <w:t xml:space="preserve"> para las regularizaciones</w:t>
             </w:r>
           </w:p>
           <w:p>
@@ -335,51 +504,117 @@
           </w:p>
           <w:p/>
           <w:p>
+            <w:proofErr w:type="gramStart"/>
             <w:r>
-              <w:t>;Impresion automatica para que imprima cada vez que pese un producto</w:t>
+              <w:t>;Impresion</w:t>
+            </w:r>
+            <w:proofErr w:type="gramEnd"/>
+            <w:r>
+              <w:t xml:space="preserve"> </w:t>
+            </w:r>
+            <w:proofErr w:type="spellStart"/>
+            <w:r>
+              <w:t>automatica</w:t>
+            </w:r>
+            <w:proofErr w:type="spellEnd"/>
+            <w:r>
+              <w:t xml:space="preserve"> para que imprima cada vez que pese un producto</w:t>
             </w:r>
           </w:p>
           <w:p>
+            <w:proofErr w:type="spellStart"/>
             <w:r>
-              <w:t>ImpresionAutomatica = T</w:t>
+              <w:t>ImpresionAutomatica</w:t>
+            </w:r>
+            <w:proofErr w:type="spellEnd"/>
+            <w:r>
+              <w:t xml:space="preserve"> = T</w:t>
             </w:r>
           </w:p>
           <w:p/>
           <w:p>
+            <w:proofErr w:type="gramStart"/>
             <w:r>
-              <w:t>;Parametros fijos para el diseño de etiquetas</w:t>
+              <w:t>;</w:t>
+            </w:r>
+            <w:proofErr w:type="spellStart"/>
+            <w:r>
+              <w:t>Parametros</w:t>
+            </w:r>
+            <w:proofErr w:type="spellEnd"/>
+            <w:proofErr w:type="gramEnd"/>
+            <w:r>
+              <w:t xml:space="preserve"> fijos para el diseño de etiquetas</w:t>
             </w:r>
           </w:p>
           <w:p>
+            <w:proofErr w:type="spellStart"/>
             <w:r>
-              <w:t>ParamCodCli = 10</w:t>
+              <w:t>ParamCodCli</w:t>
+            </w:r>
+            <w:proofErr w:type="spellEnd"/>
+            <w:r>
+              <w:t xml:space="preserve"> = 10</w:t>
             </w:r>
           </w:p>
           <w:p>
+            <w:proofErr w:type="spellStart"/>
             <w:r>
-              <w:t>ParamLote = L012226</w:t>
+              <w:t>ParamLote</w:t>
+            </w:r>
+            <w:proofErr w:type="spellEnd"/>
+            <w:r>
+              <w:t xml:space="preserve"> = L012226</w:t>
             </w:r>
           </w:p>
           <w:p>
+            <w:proofErr w:type="spellStart"/>
             <w:r>
-              <w:t>Paramid = 1</w:t>
+              <w:t>Paramid</w:t>
+            </w:r>
+            <w:proofErr w:type="spellEnd"/>
+            <w:r>
+              <w:t xml:space="preserve"> = 1</w:t>
             </w:r>
           </w:p>
           <w:p/>
           <w:p>
+            <w:proofErr w:type="gramStart"/>
             <w:r>
-              <w:t>;Impresora para las etiquetas</w:t>
+              <w:t>;Impresora</w:t>
+            </w:r>
+            <w:proofErr w:type="gramEnd"/>
+            <w:r>
+              <w:t xml:space="preserve"> para las etiquetas</w:t>
             </w:r>
           </w:p>
           <w:p>
+            <w:proofErr w:type="spellStart"/>
             <w:r>
-              <w:t>ImpresoraEtiArt = A3 Printer PDF</w:t>
+              <w:t>ImpresoraEtiArt</w:t>
+            </w:r>
+            <w:proofErr w:type="spellEnd"/>
+            <w:r>
+              <w:t xml:space="preserve"> = A3 </w:t>
+            </w:r>
+            <w:proofErr w:type="spellStart"/>
+            <w:r>
+              <w:t>Printer</w:t>
+            </w:r>
+            <w:proofErr w:type="spellEnd"/>
+            <w:r>
+              <w:t xml:space="preserve"> PDF</w:t>
             </w:r>
           </w:p>
           <w:p/>
           <w:p>
+            <w:proofErr w:type="gramStart"/>
             <w:r>
-              <w:t>;Código de la etiqueta por defecto</w:t>
+              <w:t>;Código</w:t>
+            </w:r>
+            <w:proofErr w:type="gramEnd"/>
+            <w:r>
+              <w:t xml:space="preserve"> de la etiqueta por defecto</w:t>
             </w:r>
           </w:p>
           <w:p>
@@ -409,7 +644,15 @@
     </w:p>
     <w:p>
       <w:r>
-        <w:t>Son los datos de configuración generales para la conexión con la bbdd y la empresa con la que vamos a trabajar</w:t>
+        <w:t xml:space="preserve">Son los datos de configuración generales para la conexión con la </w:t>
+      </w:r>
+      <w:proofErr w:type="spellStart"/>
+      <w:r>
+        <w:t>bbdd</w:t>
+      </w:r>
+      <w:proofErr w:type="spellEnd"/>
+      <w:r>
+        <w:t xml:space="preserve"> y la empresa con la que vamos a trabajar</w:t>
       </w:r>
     </w:p>
     <w:p>
@@ -450,7 +693,15 @@
         <w:spacing w:after="0" w:line="240" w:lineRule="auto"/>
       </w:pPr>
       <w:r>
-        <w:t>Timer = Tiempo en ms que esperará la bascula entre lectura y lectura</w:t>
+        <w:t xml:space="preserve">Timer = Tiempo en ms que esperará la </w:t>
+      </w:r>
+      <w:proofErr w:type="spellStart"/>
+      <w:r>
+        <w:t>bascula</w:t>
+      </w:r>
+      <w:proofErr w:type="spellEnd"/>
+      <w:r>
+        <w:t xml:space="preserve"> entre lectura y lectura</w:t>
       </w:r>
     </w:p>
     <w:p>
@@ -463,7 +714,15 @@
         <w:spacing w:after="0" w:line="240" w:lineRule="auto"/>
       </w:pPr>
       <w:r>
-        <w:t>Bascula = Código de la bascula que realiza la lectura</w:t>
+        <w:t xml:space="preserve">Bascula = Código de la </w:t>
+      </w:r>
+      <w:proofErr w:type="spellStart"/>
+      <w:r>
+        <w:t>bascula</w:t>
+      </w:r>
+      <w:proofErr w:type="spellEnd"/>
+      <w:r>
+        <w:t xml:space="preserve"> que realiza la lectura</w:t>
       </w:r>
     </w:p>
     <w:p>
@@ -498,8 +757,29 @@
       <w:pPr>
         <w:spacing w:after="0" w:line="240" w:lineRule="auto"/>
       </w:pPr>
-      <w:r>
-        <w:t>ImpresionAutomatica = Impresion automatica para que imprima cada vez que pese un producto (T,F)</w:t>
+      <w:proofErr w:type="spellStart"/>
+      <w:r>
+        <w:t>ImpresionAutomatica</w:t>
+      </w:r>
+      <w:proofErr w:type="spellEnd"/>
+      <w:r>
+        <w:t xml:space="preserve"> = Impresion </w:t>
+      </w:r>
+      <w:proofErr w:type="spellStart"/>
+      <w:r>
+        <w:t>automatica</w:t>
+      </w:r>
+      <w:proofErr w:type="spellEnd"/>
+      <w:r>
+        <w:t xml:space="preserve"> para que imprima cada vez que pese un producto (</w:t>
+      </w:r>
+      <w:proofErr w:type="gramStart"/>
+      <w:r>
+        <w:t>T,F</w:t>
+      </w:r>
+      <w:proofErr w:type="gramEnd"/>
+      <w:r>
+        <w:t>)</w:t>
       </w:r>
     </w:p>
     <w:p>
@@ -511,33 +791,66 @@
       <w:pPr>
         <w:spacing w:after="0" w:line="240" w:lineRule="auto"/>
       </w:pPr>
-      <w:r>
-        <w:t>;Parametros fijos para el diseño de etiquetas</w:t>
+      <w:proofErr w:type="gramStart"/>
+      <w:r>
+        <w:t>;</w:t>
+      </w:r>
+      <w:proofErr w:type="spellStart"/>
+      <w:r>
+        <w:t>Parametros</w:t>
+      </w:r>
+      <w:proofErr w:type="spellEnd"/>
+      <w:proofErr w:type="gramEnd"/>
+      <w:r>
+        <w:t xml:space="preserve"> fijos para el diseño de etiquetas</w:t>
       </w:r>
     </w:p>
     <w:p>
       <w:pPr>
         <w:spacing w:after="0" w:line="240" w:lineRule="auto"/>
       </w:pPr>
-      <w:r>
-        <w:t>ParamCodCli = Codigo de cliente</w:t>
+      <w:proofErr w:type="spellStart"/>
+      <w:r>
+        <w:t>ParamCodCli</w:t>
+      </w:r>
+      <w:proofErr w:type="spellEnd"/>
+      <w:r>
+        <w:t xml:space="preserve"> = </w:t>
+      </w:r>
+      <w:proofErr w:type="spellStart"/>
+      <w:r>
+        <w:t>Codigo</w:t>
+      </w:r>
+      <w:proofErr w:type="spellEnd"/>
+      <w:r>
+        <w:t xml:space="preserve"> de cliente</w:t>
       </w:r>
     </w:p>
     <w:p>
       <w:pPr>
         <w:spacing w:after="0" w:line="240" w:lineRule="auto"/>
       </w:pPr>
-      <w:r>
-        <w:t>ParamLote = Lote</w:t>
+      <w:proofErr w:type="spellStart"/>
+      <w:r>
+        <w:t>ParamLote</w:t>
+      </w:r>
+      <w:proofErr w:type="spellEnd"/>
+      <w:r>
+        <w:t xml:space="preserve"> = Lote</w:t>
       </w:r>
     </w:p>
     <w:p>
       <w:pPr>
         <w:spacing w:after="0" w:line="240" w:lineRule="auto"/>
       </w:pPr>
+      <w:proofErr w:type="spellStart"/>
       <w:r>
         <w:lastRenderedPageBreak/>
-        <w:t>Paramid = Id de la pesada</w:t>
+        <w:t>Paramid</w:t>
+      </w:r>
+      <w:proofErr w:type="spellEnd"/>
+      <w:r>
+        <w:t xml:space="preserve"> = Id de la pesada</w:t>
       </w:r>
     </w:p>
     <w:p>
@@ -546,13 +859,21 @@
       </w:pPr>
     </w:p>
     <w:p>
-      <w:r>
-        <w:t>ImpresoraEtiArt = Impresora para las etiquetas</w:t>
-      </w:r>
-    </w:p>
-    <w:p>
-      <w:r>
-        <w:t>Etiqueta = Etiqueta por defecto para la impresion</w:t>
+      <w:proofErr w:type="spellStart"/>
+      <w:r>
+        <w:t>ImpresoraEtiArt</w:t>
+      </w:r>
+      <w:proofErr w:type="spellEnd"/>
+      <w:r>
+        <w:t xml:space="preserve"> = Impresora para las etiquetas</w:t>
+      </w:r>
+    </w:p>
+    <w:p>
+      <w:r>
+        <w:t xml:space="preserve">Etiqueta = Etiqueta por defecto para la </w:t>
+      </w:r>
+      <w:r>
+        <w:t>impresión</w:t>
       </w:r>
     </w:p>
     <w:p>
@@ -560,6 +881,258 @@
         <w:pStyle w:val="Ttulo1"/>
       </w:pPr>
       <w:r>
+        <w:t>CONFIGURACION</w:t>
+      </w:r>
+      <w:r>
+        <w:t xml:space="preserve"> DE LA BÁSCULA</w:t>
+      </w:r>
+    </w:p>
+    <w:p/>
+    <w:p>
+      <w:r>
+        <w:t>Para configurar la bascula correctamente y que trabaje con el protocolo $.</w:t>
+      </w:r>
+    </w:p>
+    <w:p>
+      <w:pPr>
+        <w:pStyle w:val="Prrafodelista"/>
+        <w:numPr>
+          <w:ilvl w:val="0"/>
+          <w:numId w:val="40"/>
+        </w:numPr>
+      </w:pPr>
+      <w:r>
+        <w:t>Entramos a la configuración pulsando el botón MODE unos segundos y saldrá la palabra PARAME.</w:t>
+      </w:r>
+    </w:p>
+    <w:p>
+      <w:pPr>
+        <w:pStyle w:val="Prrafodelista"/>
+        <w:numPr>
+          <w:ilvl w:val="0"/>
+          <w:numId w:val="40"/>
+        </w:numPr>
+      </w:pPr>
+      <w:r>
+        <w:t>Seleccionamos con PRINT</w:t>
+      </w:r>
+    </w:p>
+    <w:p>
+      <w:pPr>
+        <w:pStyle w:val="Prrafodelista"/>
+        <w:numPr>
+          <w:ilvl w:val="0"/>
+          <w:numId w:val="40"/>
+        </w:numPr>
+      </w:pPr>
+      <w:r>
+        <w:t>Debe salir Con1. Si no, buscarlo con las flechas arriba y abajo. Una vez salga pulsar PRINT</w:t>
+      </w:r>
+    </w:p>
+    <w:p>
+      <w:pPr>
+        <w:pStyle w:val="Prrafodelista"/>
+        <w:numPr>
+          <w:ilvl w:val="0"/>
+          <w:numId w:val="40"/>
+        </w:numPr>
+      </w:pPr>
+      <w:r>
+        <w:t xml:space="preserve">Aparece </w:t>
+      </w:r>
+      <w:proofErr w:type="gramStart"/>
+      <w:r>
+        <w:t>FRAME</w:t>
+      </w:r>
+      <w:proofErr w:type="gramEnd"/>
+      <w:r>
+        <w:t xml:space="preserve">. Pulsamos PRINT. Tiene que poner 8n1. </w:t>
+      </w:r>
+      <w:r>
+        <w:t>Si no, buscarlo con las flechas arriba y abajo. Pulsamos PRINT</w:t>
+      </w:r>
+      <w:r>
+        <w:t>.</w:t>
+      </w:r>
+    </w:p>
+    <w:p>
+      <w:pPr>
+        <w:pStyle w:val="Prrafodelista"/>
+        <w:numPr>
+          <w:ilvl w:val="0"/>
+          <w:numId w:val="40"/>
+        </w:numPr>
+      </w:pPr>
+      <w:r>
+        <w:t xml:space="preserve">Aparece BAUD. </w:t>
+      </w:r>
+      <w:r>
+        <w:t xml:space="preserve"> Pulsamos PRINT</w:t>
+      </w:r>
+      <w:r>
+        <w:t xml:space="preserve">. Tiene que poner 9600. </w:t>
+      </w:r>
+      <w:r>
+        <w:t xml:space="preserve"> Si no, buscarlo con las flechas arriba y abajo. Pulsamos PRINT.</w:t>
+      </w:r>
+    </w:p>
+    <w:p>
+      <w:pPr>
+        <w:pStyle w:val="Prrafodelista"/>
+        <w:numPr>
+          <w:ilvl w:val="0"/>
+          <w:numId w:val="40"/>
+        </w:numPr>
+      </w:pPr>
+      <w:r>
+        <w:t xml:space="preserve">Aparece PROTOCOL. </w:t>
+      </w:r>
+      <w:r>
+        <w:t>Pulsamos PRINT</w:t>
+      </w:r>
+      <w:r>
+        <w:t xml:space="preserve">. Tiene que poner EPSA. </w:t>
+      </w:r>
+      <w:r>
+        <w:t>Si no, buscarlo con las flechas arriba y abajo. Pulsamos PRINT.</w:t>
+      </w:r>
+    </w:p>
+    <w:p>
+      <w:pPr>
+        <w:pStyle w:val="Prrafodelista"/>
+        <w:numPr>
+          <w:ilvl w:val="0"/>
+          <w:numId w:val="40"/>
+        </w:numPr>
+      </w:pPr>
+      <w:r>
+        <w:t xml:space="preserve">Aparece DIRECC. </w:t>
+      </w:r>
+      <w:r>
+        <w:t>Pulsamos PRINT. Tiene que poner</w:t>
+      </w:r>
+      <w:r>
+        <w:t xml:space="preserve"> Add 00</w:t>
+      </w:r>
+      <w:r>
+        <w:t>. Pulsamos PRINT.</w:t>
+      </w:r>
+    </w:p>
+    <w:p>
+      <w:pPr>
+        <w:pStyle w:val="Prrafodelista"/>
+        <w:numPr>
+          <w:ilvl w:val="0"/>
+          <w:numId w:val="40"/>
+        </w:numPr>
+      </w:pPr>
+      <w:r>
+        <w:t xml:space="preserve">Aparece </w:t>
+      </w:r>
+      <w:proofErr w:type="spellStart"/>
+      <w:r>
+        <w:t>Envio</w:t>
+      </w:r>
+      <w:proofErr w:type="spellEnd"/>
+      <w:r>
+        <w:t xml:space="preserve">.  </w:t>
+      </w:r>
+      <w:r>
+        <w:t>Pulsamos PRINT</w:t>
+      </w:r>
+      <w:r>
+        <w:t>. Tiene que poner PCPEt1.</w:t>
+      </w:r>
+      <w:r>
+        <w:t xml:space="preserve"> </w:t>
+      </w:r>
+      <w:r>
+        <w:t>Si no, buscarlo con las flechas arriba y abajo. Pulsamos PRINT.</w:t>
+      </w:r>
+    </w:p>
+    <w:p>
+      <w:pPr>
+        <w:pStyle w:val="Prrafodelista"/>
+        <w:numPr>
+          <w:ilvl w:val="0"/>
+          <w:numId w:val="40"/>
+        </w:numPr>
+      </w:pPr>
+      <w:r>
+        <w:t xml:space="preserve">Vuelve a aparecer </w:t>
+      </w:r>
+      <w:proofErr w:type="gramStart"/>
+      <w:r>
+        <w:t>FRAME</w:t>
+      </w:r>
+      <w:proofErr w:type="gramEnd"/>
+      <w:r>
+        <w:t>.</w:t>
+      </w:r>
+    </w:p>
+    <w:p>
+      <w:pPr>
+        <w:pStyle w:val="Prrafodelista"/>
+        <w:numPr>
+          <w:ilvl w:val="0"/>
+          <w:numId w:val="40"/>
+        </w:numPr>
+      </w:pPr>
+      <w:r>
+        <w:t>Salimos de la configuración pulsando varias veces MR.</w:t>
+      </w:r>
+    </w:p>
+    <w:p>
+      <w:pPr>
+        <w:pStyle w:val="Prrafodelista"/>
+      </w:pPr>
+    </w:p>
+    <w:p>
+      <w:pPr>
+        <w:pStyle w:val="Prrafodelista"/>
+      </w:pPr>
+    </w:p>
+    <w:p>
+      <w:pPr>
+        <w:pStyle w:val="Prrafodelista"/>
+      </w:pPr>
+    </w:p>
+    <w:p>
+      <w:pPr>
+        <w:pStyle w:val="Prrafodelista"/>
+      </w:pPr>
+    </w:p>
+    <w:p>
+      <w:pPr>
+        <w:pStyle w:val="Prrafodelista"/>
+      </w:pPr>
+    </w:p>
+    <w:p>
+      <w:pPr>
+        <w:pStyle w:val="Prrafodelista"/>
+      </w:pPr>
+    </w:p>
+    <w:p>
+      <w:pPr>
+        <w:pStyle w:val="Prrafodelista"/>
+      </w:pPr>
+    </w:p>
+    <w:p>
+      <w:pPr>
+        <w:pStyle w:val="Prrafodelista"/>
+      </w:pPr>
+    </w:p>
+    <w:p>
+      <w:pPr>
+        <w:pStyle w:val="Prrafodelista"/>
+      </w:pPr>
+    </w:p>
+    <w:p>
+      <w:pPr>
+        <w:pStyle w:val="Ttulo1"/>
+      </w:pPr>
+      <w:r>
+        <w:lastRenderedPageBreak/>
         <w:t>FUNCIONAMIENTO DE LA APLICACIÓN</w:t>
       </w:r>
     </w:p>
@@ -892,6 +1465,9 @@
         <w:t xml:space="preserve">Los formatos de etiquetas se crearán desde el módulo con el botón </w:t>
       </w:r>
       <w:r>
+        <w:rPr>
+          <w:noProof/>
+        </w:rPr>
         <w:drawing>
           <wp:inline distT="0" distB="0" distL="0" distR="0" wp14:anchorId="027D5350" wp14:editId="1CF1D25F">
             <wp:extent cx="381033" cy="358171"/>
@@ -934,6 +1510,9 @@
     </w:p>
     <w:p>
       <w:r>
+        <w:rPr>
+          <w:noProof/>
+        </w:rPr>
         <w:drawing>
           <wp:inline distT="0" distB="0" distL="0" distR="0" wp14:anchorId="61B34479" wp14:editId="3F471BA6">
             <wp:extent cx="4881093" cy="2151651"/>
@@ -1007,6 +1586,7 @@
       </w:pPr>
       <w:r>
         <w:rPr>
+          <w:noProof/>
           <w:color w:val="4F81BD" w:themeColor="accent1"/>
         </w:rPr>
         <w:drawing>
@@ -1059,21 +1639,41 @@
         <w:t xml:space="preserve">Para </w:t>
       </w:r>
       <w:r>
-        <w:t xml:space="preserve">asignar una etiqueta en concreto a un cliente o a un articulo de un cliente, lo haremos en la pestaña de </w:t>
+        <w:t xml:space="preserve">asignar una etiqueta en concreto a un cliente o a un </w:t>
+      </w:r>
+      <w:proofErr w:type="spellStart"/>
+      <w:r>
+        <w:t>articulo</w:t>
+      </w:r>
+      <w:proofErr w:type="spellEnd"/>
+      <w:r>
+        <w:t xml:space="preserve"> de un cliente, lo haremos en la pestaña de </w:t>
       </w:r>
       <w:r>
         <w:rPr>
           <w:i/>
           <w:iCs/>
         </w:rPr>
-        <w:t>Etiquetas cliente articulo</w:t>
-      </w:r>
+        <w:t xml:space="preserve">Etiquetas cliente </w:t>
+      </w:r>
+      <w:proofErr w:type="spellStart"/>
+      <w:r>
+        <w:rPr>
+          <w:i/>
+          <w:iCs/>
+        </w:rPr>
+        <w:t>articulo</w:t>
+      </w:r>
+      <w:proofErr w:type="spellEnd"/>
       <w:r>
         <w:t xml:space="preserve"> de la ficha del cliente.</w:t>
       </w:r>
     </w:p>
     <w:p>
       <w:r>
+        <w:rPr>
+          <w:noProof/>
+        </w:rPr>
         <w:lastRenderedPageBreak/>
         <w:drawing>
           <wp:inline distT="0" distB="0" distL="0" distR="0" wp14:anchorId="1FBA0C2B" wp14:editId="00F1E98E">
@@ -1114,7 +1714,15 @@
     </w:p>
     <w:p>
       <w:r>
-        <w:t>Si dejamos el campo articulo en blanco, lo toma como la etiqueta del cliente.</w:t>
+        <w:t xml:space="preserve">Si dejamos el campo </w:t>
+      </w:r>
+      <w:proofErr w:type="spellStart"/>
+      <w:r>
+        <w:t>articulo</w:t>
+      </w:r>
+      <w:proofErr w:type="spellEnd"/>
+      <w:r>
+        <w:t xml:space="preserve"> en blanco, lo toma como la etiqueta del cliente.</w:t>
       </w:r>
     </w:p>
     <w:p>
@@ -1133,13 +1741,42 @@
       </w:r>
     </w:p>
     <w:p>
-      <w:r>
-        <w:t>Los datos a mostrar en la etiqueta que están relacionados con el artículo, se indicaran en los campos externos del articulo.</w:t>
-      </w:r>
-    </w:p>
-    <w:p>
-      <w:r>
-        <w:t>Si queremos personalizar estos datos por cliente/articulo, los indicaremos en la referencia del articulo para ese cliente.</w:t>
+      <w:proofErr w:type="gramStart"/>
+      <w:r>
+        <w:t>Los datos a mostrar</w:t>
+      </w:r>
+      <w:proofErr w:type="gramEnd"/>
+      <w:r>
+        <w:t xml:space="preserve"> en la etiqueta que están relacionados con el </w:t>
+      </w:r>
+      <w:proofErr w:type="gramStart"/>
+      <w:r>
+        <w:t>artículo,</w:t>
+      </w:r>
+      <w:proofErr w:type="gramEnd"/>
+      <w:r>
+        <w:t xml:space="preserve"> se indicaran en los campos externos del </w:t>
+      </w:r>
+      <w:proofErr w:type="spellStart"/>
+      <w:r>
+        <w:t>articulo</w:t>
+      </w:r>
+      <w:proofErr w:type="spellEnd"/>
+      <w:r>
+        <w:t>.</w:t>
+      </w:r>
+    </w:p>
+    <w:p>
+      <w:r>
+        <w:t xml:space="preserve">Si queremos personalizar estos datos por cliente/articulo, los indicaremos en la referencia del </w:t>
+      </w:r>
+      <w:proofErr w:type="spellStart"/>
+      <w:r>
+        <w:t>articulo</w:t>
+      </w:r>
+      <w:proofErr w:type="spellEnd"/>
+      <w:r>
+        <w:t xml:space="preserve"> para ese cliente.</w:t>
       </w:r>
     </w:p>
     <w:p/>
@@ -1213,10 +1850,10 @@
     <w:p>
       <w:r>
         <w:drawing>
-          <wp:inline distT="0" distB="0" distL="0" distR="0" wp14:anchorId="62D9D0E0" wp14:editId="08342A73">
-            <wp:extent cx="6120765" cy="3432175"/>
+          <wp:inline distT="0" distB="0" distL="0" distR="0" wp14:anchorId="108BB3FD" wp14:editId="0BC68D5F">
+            <wp:extent cx="6120765" cy="5774690"/>
             <wp:effectExtent l="0" t="0" r="0" b="0"/>
-            <wp:docPr id="110154391" name="Imagen 1"/>
+            <wp:docPr id="130123939" name="Imagen 1"/>
             <wp:cNvGraphicFramePr>
               <a:graphicFrameLocks xmlns:a="http://schemas.openxmlformats.org/drawingml/2006/main" noChangeAspect="1"/>
             </wp:cNvGraphicFramePr>
@@ -1224,7 +1861,7 @@
               <a:graphicData uri="http://schemas.openxmlformats.org/drawingml/2006/picture">
                 <pic:pic xmlns:pic="http://schemas.openxmlformats.org/drawingml/2006/picture">
                   <pic:nvPicPr>
-                    <pic:cNvPr id="110154391" name=""/>
+                    <pic:cNvPr id="130123939" name=""/>
                     <pic:cNvPicPr/>
                   </pic:nvPicPr>
                   <pic:blipFill>
@@ -1236,7 +1873,7 @@
                   <pic:spPr>
                     <a:xfrm>
                       <a:off x="0" y="0"/>
-                      <a:ext cx="6120765" cy="3432175"/>
+                      <a:ext cx="6120765" cy="5774690"/>
                     </a:xfrm>
                     <a:prstGeom prst="rect">
                       <a:avLst/>
@@ -1264,74 +1901,38 @@
     </w:p>
     <w:p>
       <w:r>
-        <w:t xml:space="preserve">En la parte inferior de la pantalla tenemos el botón </w:t>
+        <w:t xml:space="preserve">Podemos cambiar el tamaño de los datos de la rejilla pulsando sobre ella y con las teclas </w:t>
+      </w:r>
+      <w:proofErr w:type="spellStart"/>
+      <w:r>
+        <w:t>ctrl</w:t>
+      </w:r>
+      <w:proofErr w:type="spellEnd"/>
+      <w:r>
+        <w:t xml:space="preserve"> + y </w:t>
+      </w:r>
+      <w:proofErr w:type="spellStart"/>
+      <w:r>
+        <w:t>ctrl</w:t>
+      </w:r>
+      <w:proofErr w:type="spellEnd"/>
+      <w:r>
+        <w:t xml:space="preserve"> -.</w:t>
+      </w:r>
+    </w:p>
+    <w:p>
+      <w:r>
+        <w:t>Podemos cambiar la distribución de las columnas al orden que queramos.</w:t>
+      </w:r>
+    </w:p>
+    <w:p>
+      <w:r>
+        <w:t xml:space="preserve">Para guardar la configuración realizada, lo haremos con el botón </w:t>
       </w:r>
       <w:r>
         <w:rPr>
-          <w:b/>
-          <w:bCs/>
+          <w:noProof/>
         </w:rPr>
-        <w:t>Teclado</w:t>
-      </w:r>
-      <w:r>
-        <w:t xml:space="preserve"> </w:t>
-      </w:r>
-      <w:r>
-        <w:drawing>
-          <wp:inline distT="0" distB="0" distL="0" distR="0" wp14:anchorId="7C03889C" wp14:editId="2E9CD191">
-            <wp:extent cx="403895" cy="358171"/>
-            <wp:effectExtent l="0" t="0" r="0" b="3810"/>
-            <wp:docPr id="1571289545" name="Imagen 1"/>
-            <wp:cNvGraphicFramePr>
-              <a:graphicFrameLocks xmlns:a="http://schemas.openxmlformats.org/drawingml/2006/main" noChangeAspect="1"/>
-            </wp:cNvGraphicFramePr>
-            <a:graphic xmlns:a="http://schemas.openxmlformats.org/drawingml/2006/main">
-              <a:graphicData uri="http://schemas.openxmlformats.org/drawingml/2006/picture">
-                <pic:pic xmlns:pic="http://schemas.openxmlformats.org/drawingml/2006/picture">
-                  <pic:nvPicPr>
-                    <pic:cNvPr id="1571289545" name=""/>
-                    <pic:cNvPicPr/>
-                  </pic:nvPicPr>
-                  <pic:blipFill>
-                    <a:blip r:embed="rId18"/>
-                    <a:stretch>
-                      <a:fillRect/>
-                    </a:stretch>
-                  </pic:blipFill>
-                  <pic:spPr>
-                    <a:xfrm>
-                      <a:off x="0" y="0"/>
-                      <a:ext cx="403895" cy="358171"/>
-                    </a:xfrm>
-                    <a:prstGeom prst="rect">
-                      <a:avLst/>
-                    </a:prstGeom>
-                  </pic:spPr>
-                </pic:pic>
-              </a:graphicData>
-            </a:graphic>
-          </wp:inline>
-        </w:drawing>
-      </w:r>
-      <w:r>
-        <w:t>. Con el podemos levantar u ocultar un teclado táctil.</w:t>
-      </w:r>
-    </w:p>
-    <w:p>
-      <w:r>
-        <w:t>Podemos cambiar el tamaño de los datos de la rejilla pulsando sobre ella y con las teclas ctrl + y ctrl -.</w:t>
-      </w:r>
-    </w:p>
-    <w:p>
-      <w:r>
-        <w:t>Podemos cambiar la distribución de las columnas al orden que queramos.</w:t>
-      </w:r>
-    </w:p>
-    <w:p>
-      <w:r>
-        <w:t xml:space="preserve">Para guardar la configuración realizada, lo haremos con el botón </w:t>
-      </w:r>
-      <w:r>
         <w:drawing>
           <wp:inline distT="0" distB="0" distL="0" distR="0" wp14:anchorId="069E87B5" wp14:editId="0AC8D431">
             <wp:extent cx="472481" cy="381033"/>
@@ -1348,7 +1949,7 @@
                     <pic:cNvPicPr/>
                   </pic:nvPicPr>
                   <pic:blipFill>
-                    <a:blip r:embed="rId19"/>
+                    <a:blip r:embed="rId18"/>
                     <a:stretch>
                       <a:fillRect/>
                     </a:stretch>
@@ -1382,6 +1983,7 @@
         <w:rPr>
           <w:rStyle w:val="nfasisintenso"/>
         </w:rPr>
+        <w:lastRenderedPageBreak/>
         <w:t>Funcionamiento</w:t>
       </w:r>
     </w:p>
@@ -1397,6 +1999,7 @@
       <w:r>
         <w:t xml:space="preserve">Si queremos cambiar el usuario, lo haremos pulsando del botón </w:t>
       </w:r>
+      <w:proofErr w:type="gramStart"/>
       <w:r>
         <w:rPr>
           <w:b/>
@@ -1407,10 +2010,10 @@
       <w:r>
         <w:t>.</w:t>
       </w:r>
-    </w:p>
-    <w:p>
-      <w:r>
-        <w:lastRenderedPageBreak/>
+      <w:proofErr w:type="gramEnd"/>
+    </w:p>
+    <w:p>
+      <w:r>
         <w:t>Para comenzar a pesar un producto indicaremos obligatoriamente los siguientes datos:</w:t>
       </w:r>
     </w:p>
@@ -1547,6 +2150,7 @@
       <w:r>
         <w:t xml:space="preserve">Podemos realizar la búsqueda de clientes, artículos o etiquetas pulsando sobre los botones </w:t>
       </w:r>
+      <w:proofErr w:type="gramStart"/>
       <w:r>
         <w:rPr>
           <w:b/>
@@ -1554,7 +2158,17 @@
           <w:i/>
           <w:iCs/>
         </w:rPr>
-        <w:t>Cliente:, Artículo o Etiqueta</w:t>
+        <w:t>Cliente:,</w:t>
+      </w:r>
+      <w:proofErr w:type="gramEnd"/>
+      <w:r>
+        <w:rPr>
+          <w:b/>
+          <w:bCs/>
+          <w:i/>
+          <w:iCs/>
+        </w:rPr>
+        <w:t xml:space="preserve"> Artículo o Etiqueta</w:t>
       </w:r>
       <w:r>
         <w:rPr>
@@ -1569,6 +2183,9 @@
         <w:t xml:space="preserve">En el desplegable </w:t>
       </w:r>
       <w:r>
+        <w:rPr>
+          <w:noProof/>
+        </w:rPr>
         <w:drawing>
           <wp:inline distT="0" distB="0" distL="0" distR="0" wp14:anchorId="1777DF72" wp14:editId="416AF230">
             <wp:extent cx="1244958" cy="257111"/>
@@ -1585,7 +2202,7 @@
                     <pic:cNvPicPr/>
                   </pic:nvPicPr>
                   <pic:blipFill>
-                    <a:blip r:embed="rId20"/>
+                    <a:blip r:embed="rId19"/>
                     <a:stretch>
                       <a:fillRect/>
                     </a:stretch>
@@ -1629,7 +2246,16 @@
     </w:p>
     <w:p>
       <w:r>
-        <w:t xml:space="preserve">Con el check </w:t>
+        <w:lastRenderedPageBreak/>
+        <w:t xml:space="preserve">Con el </w:t>
+      </w:r>
+      <w:proofErr w:type="spellStart"/>
+      <w:r>
+        <w:t>check</w:t>
+      </w:r>
+      <w:proofErr w:type="spellEnd"/>
+      <w:r>
+        <w:t xml:space="preserve"> </w:t>
       </w:r>
       <w:r>
         <w:rPr>
@@ -1650,11 +2276,7 @@
     </w:p>
     <w:p>
       <w:r>
-        <w:t xml:space="preserve">Al insertar un lote se comprobará que los dos primeros caracteres de ese lote se corresponden con algunos de los tipos de los artículos y se mostrará un mensaje </w:t>
-      </w:r>
-      <w:r>
-        <w:lastRenderedPageBreak/>
-        <w:t>indicando que tipo de articulo es y si no se corresponde, se indicará que no pertenece a ningún tipo de artículo.</w:t>
+        <w:t>Al insertar un lote se comprobará que los dos primeros caracteres de ese lote se corresponden con algunos de los tipos de los artículos y se mostrará un mensaje indicando que tipo de articulo es y si no se corresponde, se indicará que no pertenece a ningún tipo de artículo.</w:t>
       </w:r>
     </w:p>
     <w:p>
@@ -1724,14 +2346,11 @@
     </w:p>
     <w:p>
       <w:r>
-        <w:rPr>
-          <w:noProof/>
-        </w:rPr>
         <w:drawing>
-          <wp:inline distT="0" distB="0" distL="0" distR="0" wp14:anchorId="504E3D5D" wp14:editId="6495007C">
-            <wp:extent cx="2301439" cy="685859"/>
-            <wp:effectExtent l="0" t="0" r="3810" b="0"/>
-            <wp:docPr id="1478156437" name="Imagen 1"/>
+          <wp:inline distT="0" distB="0" distL="0" distR="0" wp14:anchorId="4DAFD6EC" wp14:editId="6DD4EA68">
+            <wp:extent cx="2372056" cy="685896"/>
+            <wp:effectExtent l="0" t="0" r="0" b="0"/>
+            <wp:docPr id="375453514" name="Imagen 1"/>
             <wp:cNvGraphicFramePr>
               <a:graphicFrameLocks xmlns:a="http://schemas.openxmlformats.org/drawingml/2006/main" noChangeAspect="1"/>
             </wp:cNvGraphicFramePr>
@@ -1739,11 +2358,11 @@
               <a:graphicData uri="http://schemas.openxmlformats.org/drawingml/2006/picture">
                 <pic:pic xmlns:pic="http://schemas.openxmlformats.org/drawingml/2006/picture">
                   <pic:nvPicPr>
-                    <pic:cNvPr id="1478156437" name=""/>
+                    <pic:cNvPr id="375453514" name=""/>
                     <pic:cNvPicPr/>
                   </pic:nvPicPr>
                   <pic:blipFill>
-                    <a:blip r:embed="rId21"/>
+                    <a:blip r:embed="rId20"/>
                     <a:stretch>
                       <a:fillRect/>
                     </a:stretch>
@@ -1751,7 +2370,7 @@
                   <pic:spPr>
                     <a:xfrm>
                       <a:off x="0" y="0"/>
-                      <a:ext cx="2301439" cy="685859"/>
+                      <a:ext cx="2372056" cy="685896"/>
                     </a:xfrm>
                     <a:prstGeom prst="rect">
                       <a:avLst/>
@@ -1772,7 +2391,13 @@
         </w:rPr>
       </w:pPr>
       <w:r>
-        <w:t xml:space="preserve">Insertaremos el peso en el campo y pulsaremos el botón </w:t>
+        <w:t xml:space="preserve">Insertaremos el peso en el </w:t>
+      </w:r>
+      <w:r>
+        <w:t>primer campo y el número de pesadas a insertar con ese peso, en el segundo campo, que por defecto estará a 1</w:t>
+      </w:r>
+      <w:r>
+        <w:t xml:space="preserve"> y pulsaremos el botón </w:t>
       </w:r>
       <w:r>
         <w:rPr>
@@ -1814,6 +2439,37 @@
       </w:r>
     </w:p>
     <w:p/>
+    <w:p/>
+    <w:p/>
+    <w:p>
+      <w:pPr>
+        <w:pStyle w:val="Ttulo2"/>
+      </w:pPr>
+      <w:r>
+        <w:lastRenderedPageBreak/>
+        <w:t>Eliminación</w:t>
+      </w:r>
+      <w:r>
+        <w:t xml:space="preserve"> de pesadas</w:t>
+      </w:r>
+    </w:p>
+    <w:p/>
+    <w:p>
+      <w:r>
+        <w:t xml:space="preserve">Si por algún motivo queremos eliminar alguna de las pesadas realizadas, seleccionaremos la pesada y con el botón derecho del ratón seleccionaremos </w:t>
+      </w:r>
+      <w:r>
+        <w:rPr>
+          <w:b/>
+          <w:bCs/>
+        </w:rPr>
+        <w:t>Eliminar pesada.</w:t>
+      </w:r>
+      <w:r>
+        <w:t xml:space="preserve"> </w:t>
+      </w:r>
+    </w:p>
+    <w:p/>
     <w:p>
       <w:pPr>
         <w:pStyle w:val="Ttulo2"/>
@@ -1862,7 +2518,6 @@
         </w:rPr>
       </w:pPr>
       <w:r>
-        <w:lastRenderedPageBreak/>
         <w:t xml:space="preserve">Para enviar las pesadas a su regularización correspondiente (aquella que contenga en su param3 el lote indicado en la pantalla), seleccionaremos las pesadas que queramos regularizar y pulsaremos el botón </w:t>
       </w:r>
       <w:r>
@@ -1912,7 +2567,7 @@
                     <pic:cNvPicPr/>
                   </pic:nvPicPr>
                   <pic:blipFill>
-                    <a:blip r:embed="rId22"/>
+                    <a:blip r:embed="rId21"/>
                     <a:stretch>
                       <a:fillRect/>
                     </a:stretch>
@@ -1946,6 +2601,7 @@
         <w:rPr>
           <w:noProof/>
         </w:rPr>
+        <w:lastRenderedPageBreak/>
         <w:drawing>
           <wp:inline distT="0" distB="0" distL="0" distR="0" wp14:anchorId="396A5AB5" wp14:editId="68885BF2">
             <wp:extent cx="6120765" cy="1998980"/>
@@ -1962,7 +2618,7 @@
                     <pic:cNvPicPr/>
                   </pic:nvPicPr>
                   <pic:blipFill>
-                    <a:blip r:embed="rId23"/>
+                    <a:blip r:embed="rId22"/>
                     <a:stretch>
                       <a:fillRect/>
                     </a:stretch>
@@ -2017,7 +2673,7 @@
                     <pic:cNvPicPr/>
                   </pic:nvPicPr>
                   <pic:blipFill>
-                    <a:blip r:embed="rId24"/>
+                    <a:blip r:embed="rId23"/>
                     <a:stretch>
                       <a:fillRect/>
                     </a:stretch>
@@ -2040,15 +2696,47 @@
     </w:p>
     <w:p>
       <w:r>
-        <w:lastRenderedPageBreak/>
         <w:t>Hay que tener en cuenta que este proceso es irreversible. Aunque luego cancelemos los cambios, lo indicado aquí ya no se recupera.</w:t>
       </w:r>
     </w:p>
     <w:p>
       <w:r>
-        <w:t>Si indicamos que si, la relación de las líneas de pesadas asociadas a la línea se eliminará y las pesadas volverán a quedar pendientes de regularizar.</w:t>
-      </w:r>
-    </w:p>
+        <w:t xml:space="preserve">Si indicamos que </w:t>
+      </w:r>
+      <w:proofErr w:type="spellStart"/>
+      <w:r>
+        <w:t>si</w:t>
+      </w:r>
+      <w:proofErr w:type="spellEnd"/>
+      <w:r>
+        <w:t>, la relación de las líneas de pesadas asociadas a la línea se eliminará y las pesadas volverán a quedar pendientes de regularizar.</w:t>
+      </w:r>
+    </w:p>
+    <w:p>
+      <w:pPr>
+        <w:pStyle w:val="Ttulo2"/>
+      </w:pPr>
+      <w:r>
+        <w:t>Modificación de la etiqueta de una pesada</w:t>
+      </w:r>
+    </w:p>
+    <w:p/>
+    <w:p>
+      <w:r>
+        <w:t xml:space="preserve">Para poder modificar la etiqueta que se ha asociado a una pesada podemos hacerlo con el botón derecho del ratón seleccionando </w:t>
+      </w:r>
+      <w:r>
+        <w:rPr>
+          <w:b/>
+          <w:bCs/>
+        </w:rPr>
+        <w:t>Cambiar etiqueta</w:t>
+      </w:r>
+      <w:r>
+        <w:t>. Se nos mostrarán las etiquetas disponibles y seleccionaremos la que deseemos. Al aceptar, la etiqueta quedará asignada a la lectura para que se imprima con el formato seleccionado.</w:t>
+      </w:r>
+    </w:p>
+    <w:p/>
     <w:p>
       <w:pPr>
         <w:pStyle w:val="Ttulo2"/>
@@ -2072,6 +2760,7 @@
         <w:rPr>
           <w:noProof/>
         </w:rPr>
+        <w:lastRenderedPageBreak/>
         <w:drawing>
           <wp:inline distT="0" distB="0" distL="0" distR="0" wp14:anchorId="74D5EA16" wp14:editId="4D8231DF">
             <wp:extent cx="624894" cy="541067"/>
@@ -2088,7 +2777,7 @@
                     <pic:cNvPicPr/>
                   </pic:nvPicPr>
                   <pic:blipFill>
-                    <a:blip r:embed="rId25"/>
+                    <a:blip r:embed="rId24"/>
                     <a:stretch>
                       <a:fillRect/>
                     </a:stretch>
@@ -2116,7 +2805,15 @@
     </w:p>
     <w:p>
       <w:r>
-        <w:t>Cuando creemos una etiqueta nueva, debemos crear su relación en A3erp para que luego se nos muestre en el desplegable del modulo.</w:t>
+        <w:t xml:space="preserve">Cuando creemos una etiqueta nueva, debemos crear su relación en A3erp para que luego se nos muestre en el desplegable del </w:t>
+      </w:r>
+      <w:proofErr w:type="spellStart"/>
+      <w:r>
+        <w:t>modulo</w:t>
+      </w:r>
+      <w:proofErr w:type="spellEnd"/>
+      <w:r>
+        <w:t>.</w:t>
       </w:r>
     </w:p>
     <w:p>
@@ -2145,7 +2842,7 @@
                     <pic:cNvPicPr/>
                   </pic:nvPicPr>
                   <pic:blipFill>
-                    <a:blip r:embed="rId26"/>
+                    <a:blip r:embed="rId25"/>
                     <a:stretch>
                       <a:fillRect/>
                     </a:stretch>
@@ -2183,8 +2880,8 @@
     <w:p/>
     <w:p/>
     <w:sectPr>
-      <w:headerReference w:type="default" r:id="rId27"/>
-      <w:footerReference w:type="default" r:id="rId28"/>
+      <w:headerReference w:type="default" r:id="rId26"/>
+      <w:footerReference w:type="default" r:id="rId27"/>
       <w:pgSz w:w="11906" w:h="16838"/>
       <w:pgMar w:top="836" w:right="1133" w:bottom="567" w:left="1134" w:header="847" w:footer="431" w:gutter="0"/>
       <w:cols w:space="708"/>
@@ -2454,16 +3151,25 @@
       <w:tab/>
     </w:r>
     <w:r>
-      <w:t xml:space="preserve"> Fecha de Redacción </w:t>
+      <w:t xml:space="preserve"> Fecha de Re</w:t>
     </w:r>
     <w:r>
-      <w:t>30</w:t>
+      <w:t>visión</w:t>
+    </w:r>
+    <w:r>
+      <w:t xml:space="preserve"> </w:t>
+    </w:r>
+    <w:r>
+      <w:t>28</w:t>
     </w:r>
     <w:r>
       <w:t>/</w:t>
     </w:r>
     <w:r>
-      <w:t>04</w:t>
+      <w:t>0</w:t>
+    </w:r>
+    <w:r>
+      <w:t>8</w:t>
     </w:r>
     <w:r>
       <w:t>/</w:t>
@@ -2621,11 +3327,28 @@
                     <wps:txbx>
                       <w:txbxContent>
                         <w:p>
+                          <w:pPr>
+                            <w:rPr>
+                              <w:sz w:val="24"/>
+                              <w:szCs w:val="24"/>
+                            </w:rPr>
+                          </w:pPr>
                           <w:r>
                             <w:t xml:space="preserve">  </w:t>
                           </w:r>
                           <w:r>
+                            <w:rPr>
+                              <w:sz w:val="24"/>
+                              <w:szCs w:val="24"/>
+                            </w:rPr>
                             <w:t>MANUAL USUARIO – GESTOR ETIQUETADO. SALAZONES SAEZ</w:t>
+                          </w:r>
+                          <w:r>
+                            <w:rPr>
+                              <w:sz w:val="24"/>
+                              <w:szCs w:val="24"/>
+                            </w:rPr>
+                            <w:t>. V.1.2.2</w:t>
                           </w:r>
                         </w:p>
                       </w:txbxContent>
@@ -2657,11 +3380,28 @@
               <v:textbox>
                 <w:txbxContent>
                   <w:p>
+                    <w:pPr>
+                      <w:rPr>
+                        <w:sz w:val="24"/>
+                        <w:szCs w:val="24"/>
+                      </w:rPr>
+                    </w:pPr>
                     <w:r>
                       <w:t xml:space="preserve">  </w:t>
                     </w:r>
                     <w:r>
+                      <w:rPr>
+                        <w:sz w:val="24"/>
+                        <w:szCs w:val="24"/>
+                      </w:rPr>
                       <w:t>MANUAL USUARIO – GESTOR ETIQUETADO. SALAZONES SAEZ</w:t>
+                    </w:r>
+                    <w:r>
+                      <w:rPr>
+                        <w:sz w:val="24"/>
+                        <w:szCs w:val="24"/>
+                      </w:rPr>
+                      <w:t>. V.1.2.2</w:t>
                     </w:r>
                   </w:p>
                 </w:txbxContent>
@@ -2902,6 +3642,95 @@
     </w:lvl>
   </w:abstractNum>
   <w:abstractNum w:abstractNumId="2" w15:restartNumberingAfterBreak="0">
+    <w:nsid w:val="05E26E2B"/>
+    <w:multiLevelType w:val="hybridMultilevel"/>
+    <w:tmpl w:val="24F2A322"/>
+    <w:lvl w:ilvl="0" w:tplc="0C0A000F">
+      <w:start w:val="1"/>
+      <w:numFmt w:val="decimal"/>
+      <w:lvlText w:val="%1."/>
+      <w:lvlJc w:val="left"/>
+      <w:pPr>
+        <w:ind w:left="720" w:hanging="360"/>
+      </w:pPr>
+      <w:rPr>
+        <w:rFonts w:hint="default"/>
+      </w:rPr>
+    </w:lvl>
+    <w:lvl w:ilvl="1" w:tplc="0C0A0019" w:tentative="1">
+      <w:start w:val="1"/>
+      <w:numFmt w:val="lowerLetter"/>
+      <w:lvlText w:val="%2."/>
+      <w:lvlJc w:val="left"/>
+      <w:pPr>
+        <w:ind w:left="1440" w:hanging="360"/>
+      </w:pPr>
+    </w:lvl>
+    <w:lvl w:ilvl="2" w:tplc="0C0A001B" w:tentative="1">
+      <w:start w:val="1"/>
+      <w:numFmt w:val="lowerRoman"/>
+      <w:lvlText w:val="%3."/>
+      <w:lvlJc w:val="right"/>
+      <w:pPr>
+        <w:ind w:left="2160" w:hanging="180"/>
+      </w:pPr>
+    </w:lvl>
+    <w:lvl w:ilvl="3" w:tplc="0C0A000F" w:tentative="1">
+      <w:start w:val="1"/>
+      <w:numFmt w:val="decimal"/>
+      <w:lvlText w:val="%4."/>
+      <w:lvlJc w:val="left"/>
+      <w:pPr>
+        <w:ind w:left="2880" w:hanging="360"/>
+      </w:pPr>
+    </w:lvl>
+    <w:lvl w:ilvl="4" w:tplc="0C0A0019" w:tentative="1">
+      <w:start w:val="1"/>
+      <w:numFmt w:val="lowerLetter"/>
+      <w:lvlText w:val="%5."/>
+      <w:lvlJc w:val="left"/>
+      <w:pPr>
+        <w:ind w:left="3600" w:hanging="360"/>
+      </w:pPr>
+    </w:lvl>
+    <w:lvl w:ilvl="5" w:tplc="0C0A001B" w:tentative="1">
+      <w:start w:val="1"/>
+      <w:numFmt w:val="lowerRoman"/>
+      <w:lvlText w:val="%6."/>
+      <w:lvlJc w:val="right"/>
+      <w:pPr>
+        <w:ind w:left="4320" w:hanging="180"/>
+      </w:pPr>
+    </w:lvl>
+    <w:lvl w:ilvl="6" w:tplc="0C0A000F" w:tentative="1">
+      <w:start w:val="1"/>
+      <w:numFmt w:val="decimal"/>
+      <w:lvlText w:val="%7."/>
+      <w:lvlJc w:val="left"/>
+      <w:pPr>
+        <w:ind w:left="5040" w:hanging="360"/>
+      </w:pPr>
+    </w:lvl>
+    <w:lvl w:ilvl="7" w:tplc="0C0A0019" w:tentative="1">
+      <w:start w:val="1"/>
+      <w:numFmt w:val="lowerLetter"/>
+      <w:lvlText w:val="%8."/>
+      <w:lvlJc w:val="left"/>
+      <w:pPr>
+        <w:ind w:left="5760" w:hanging="360"/>
+      </w:pPr>
+    </w:lvl>
+    <w:lvl w:ilvl="8" w:tplc="0C0A001B" w:tentative="1">
+      <w:start w:val="1"/>
+      <w:numFmt w:val="lowerRoman"/>
+      <w:lvlText w:val="%9."/>
+      <w:lvlJc w:val="right"/>
+      <w:pPr>
+        <w:ind w:left="6480" w:hanging="180"/>
+      </w:pPr>
+    </w:lvl>
+  </w:abstractNum>
+  <w:abstractNum w:abstractNumId="3" w15:restartNumberingAfterBreak="0">
     <w:nsid w:val="07754D0B"/>
     <w:multiLevelType w:val="hybridMultilevel"/>
     <w:tmpl w:val="673CED62"/>
@@ -3013,7 +3842,7 @@
       </w:rPr>
     </w:lvl>
   </w:abstractNum>
-  <w:abstractNum w:abstractNumId="3" w15:restartNumberingAfterBreak="0">
+  <w:abstractNum w:abstractNumId="4" w15:restartNumberingAfterBreak="0">
     <w:nsid w:val="0B2369EB"/>
     <w:multiLevelType w:val="hybridMultilevel"/>
     <w:tmpl w:val="C4AEBA66"/>
@@ -3105,7 +3934,7 @@
       </w:pPr>
     </w:lvl>
   </w:abstractNum>
-  <w:abstractNum w:abstractNumId="4" w15:restartNumberingAfterBreak="0">
+  <w:abstractNum w:abstractNumId="5" w15:restartNumberingAfterBreak="0">
     <w:nsid w:val="0E3A7CB3"/>
     <w:multiLevelType w:val="hybridMultilevel"/>
     <w:tmpl w:val="DD6E4500"/>
@@ -3217,7 +4046,7 @@
       </w:rPr>
     </w:lvl>
   </w:abstractNum>
-  <w:abstractNum w:abstractNumId="5" w15:restartNumberingAfterBreak="0">
+  <w:abstractNum w:abstractNumId="6" w15:restartNumberingAfterBreak="0">
     <w:nsid w:val="0EE46C28"/>
     <w:multiLevelType w:val="hybridMultilevel"/>
     <w:tmpl w:val="D65C2C4A"/>
@@ -3303,7 +4132,7 @@
       </w:pPr>
     </w:lvl>
   </w:abstractNum>
-  <w:abstractNum w:abstractNumId="6" w15:restartNumberingAfterBreak="0">
+  <w:abstractNum w:abstractNumId="7" w15:restartNumberingAfterBreak="0">
     <w:nsid w:val="10E67E4A"/>
     <w:multiLevelType w:val="hybridMultilevel"/>
     <w:tmpl w:val="E0E674C2"/>
@@ -3415,7 +4244,7 @@
       </w:rPr>
     </w:lvl>
   </w:abstractNum>
-  <w:abstractNum w:abstractNumId="7" w15:restartNumberingAfterBreak="0">
+  <w:abstractNum w:abstractNumId="8" w15:restartNumberingAfterBreak="0">
     <w:nsid w:val="1C0073B0"/>
     <w:multiLevelType w:val="multilevel"/>
     <w:tmpl w:val="0778E94A"/>
@@ -3564,7 +4393,7 @@
       </w:rPr>
     </w:lvl>
   </w:abstractNum>
-  <w:abstractNum w:abstractNumId="8" w15:restartNumberingAfterBreak="0">
+  <w:abstractNum w:abstractNumId="9" w15:restartNumberingAfterBreak="0">
     <w:nsid w:val="1DCF45B5"/>
     <w:multiLevelType w:val="hybridMultilevel"/>
     <w:tmpl w:val="986C0348"/>
@@ -3676,7 +4505,7 @@
       </w:rPr>
     </w:lvl>
   </w:abstractNum>
-  <w:abstractNum w:abstractNumId="9" w15:restartNumberingAfterBreak="0">
+  <w:abstractNum w:abstractNumId="10" w15:restartNumberingAfterBreak="0">
     <w:nsid w:val="24ED4AFC"/>
     <w:multiLevelType w:val="hybridMultilevel"/>
     <w:tmpl w:val="C1FC5E72"/>
@@ -3788,7 +4617,7 @@
       </w:rPr>
     </w:lvl>
   </w:abstractNum>
-  <w:abstractNum w:abstractNumId="10" w15:restartNumberingAfterBreak="0">
+  <w:abstractNum w:abstractNumId="11" w15:restartNumberingAfterBreak="0">
     <w:nsid w:val="28CF3CE4"/>
     <w:multiLevelType w:val="hybridMultilevel"/>
     <w:tmpl w:val="801E8D2C"/>
@@ -3900,7 +4729,7 @@
       </w:rPr>
     </w:lvl>
   </w:abstractNum>
-  <w:abstractNum w:abstractNumId="11" w15:restartNumberingAfterBreak="0">
+  <w:abstractNum w:abstractNumId="12" w15:restartNumberingAfterBreak="0">
     <w:nsid w:val="291832EB"/>
     <w:multiLevelType w:val="hybridMultilevel"/>
     <w:tmpl w:val="9198F6B2"/>
@@ -4013,7 +4842,7 @@
       </w:rPr>
     </w:lvl>
   </w:abstractNum>
-  <w:abstractNum w:abstractNumId="12" w15:restartNumberingAfterBreak="0">
+  <w:abstractNum w:abstractNumId="13" w15:restartNumberingAfterBreak="0">
     <w:nsid w:val="2CFF6A9A"/>
     <w:multiLevelType w:val="hybridMultilevel"/>
     <w:tmpl w:val="52B2E9C8"/>
@@ -4125,7 +4954,7 @@
       </w:rPr>
     </w:lvl>
   </w:abstractNum>
-  <w:abstractNum w:abstractNumId="13" w15:restartNumberingAfterBreak="0">
+  <w:abstractNum w:abstractNumId="14" w15:restartNumberingAfterBreak="0">
     <w:nsid w:val="2E1F26A7"/>
     <w:multiLevelType w:val="hybridMultilevel"/>
     <w:tmpl w:val="215AE492"/>
@@ -4238,7 +5067,7 @@
       </w:rPr>
     </w:lvl>
   </w:abstractNum>
-  <w:abstractNum w:abstractNumId="14" w15:restartNumberingAfterBreak="0">
+  <w:abstractNum w:abstractNumId="15" w15:restartNumberingAfterBreak="0">
     <w:nsid w:val="319A2BD3"/>
     <w:multiLevelType w:val="multilevel"/>
     <w:tmpl w:val="F348D0E6"/>
@@ -4387,7 +5216,7 @@
       </w:rPr>
     </w:lvl>
   </w:abstractNum>
-  <w:abstractNum w:abstractNumId="15" w15:restartNumberingAfterBreak="0">
+  <w:abstractNum w:abstractNumId="16" w15:restartNumberingAfterBreak="0">
     <w:nsid w:val="33481297"/>
     <w:multiLevelType w:val="hybridMultilevel"/>
     <w:tmpl w:val="A9EAE052"/>
@@ -4473,7 +5302,7 @@
       </w:pPr>
     </w:lvl>
   </w:abstractNum>
-  <w:abstractNum w:abstractNumId="16" w15:restartNumberingAfterBreak="0">
+  <w:abstractNum w:abstractNumId="17" w15:restartNumberingAfterBreak="0">
     <w:nsid w:val="3D19293C"/>
     <w:multiLevelType w:val="multilevel"/>
     <w:tmpl w:val="53C8B768"/>
@@ -4622,7 +5451,7 @@
       </w:rPr>
     </w:lvl>
   </w:abstractNum>
-  <w:abstractNum w:abstractNumId="17" w15:restartNumberingAfterBreak="0">
+  <w:abstractNum w:abstractNumId="18" w15:restartNumberingAfterBreak="0">
     <w:nsid w:val="3EBC734B"/>
     <w:multiLevelType w:val="hybridMultilevel"/>
     <w:tmpl w:val="EBC45066"/>
@@ -4734,7 +5563,7 @@
       </w:rPr>
     </w:lvl>
   </w:abstractNum>
-  <w:abstractNum w:abstractNumId="18" w15:restartNumberingAfterBreak="0">
+  <w:abstractNum w:abstractNumId="19" w15:restartNumberingAfterBreak="0">
     <w:nsid w:val="3F9878F2"/>
     <w:multiLevelType w:val="hybridMultilevel"/>
     <w:tmpl w:val="79F426D4"/>
@@ -4847,7 +5676,7 @@
       </w:rPr>
     </w:lvl>
   </w:abstractNum>
-  <w:abstractNum w:abstractNumId="19" w15:restartNumberingAfterBreak="0">
+  <w:abstractNum w:abstractNumId="20" w15:restartNumberingAfterBreak="0">
     <w:nsid w:val="430551D8"/>
     <w:multiLevelType w:val="hybridMultilevel"/>
     <w:tmpl w:val="1A1C0656"/>
@@ -4959,7 +5788,7 @@
       </w:rPr>
     </w:lvl>
   </w:abstractNum>
-  <w:abstractNum w:abstractNumId="20" w15:restartNumberingAfterBreak="0">
+  <w:abstractNum w:abstractNumId="21" w15:restartNumberingAfterBreak="0">
     <w:nsid w:val="4599470F"/>
     <w:multiLevelType w:val="hybridMultilevel"/>
     <w:tmpl w:val="3A900FC8"/>
@@ -5071,7 +5900,7 @@
       </w:rPr>
     </w:lvl>
   </w:abstractNum>
-  <w:abstractNum w:abstractNumId="21" w15:restartNumberingAfterBreak="0">
+  <w:abstractNum w:abstractNumId="22" w15:restartNumberingAfterBreak="0">
     <w:nsid w:val="507A1738"/>
     <w:multiLevelType w:val="multilevel"/>
     <w:tmpl w:val="DF403F7A"/>
@@ -5220,7 +6049,7 @@
       </w:rPr>
     </w:lvl>
   </w:abstractNum>
-  <w:abstractNum w:abstractNumId="22" w15:restartNumberingAfterBreak="0">
+  <w:abstractNum w:abstractNumId="23" w15:restartNumberingAfterBreak="0">
     <w:nsid w:val="571C1E25"/>
     <w:multiLevelType w:val="hybridMultilevel"/>
     <w:tmpl w:val="6EF6712A"/>
@@ -5332,7 +6161,7 @@
       </w:rPr>
     </w:lvl>
   </w:abstractNum>
-  <w:abstractNum w:abstractNumId="23" w15:restartNumberingAfterBreak="0">
+  <w:abstractNum w:abstractNumId="24" w15:restartNumberingAfterBreak="0">
     <w:nsid w:val="5B406F4C"/>
     <w:multiLevelType w:val="multilevel"/>
     <w:tmpl w:val="0DB0623C"/>
@@ -5481,7 +6310,7 @@
       </w:rPr>
     </w:lvl>
   </w:abstractNum>
-  <w:abstractNum w:abstractNumId="24" w15:restartNumberingAfterBreak="0">
+  <w:abstractNum w:abstractNumId="25" w15:restartNumberingAfterBreak="0">
     <w:nsid w:val="5F256C33"/>
     <w:multiLevelType w:val="hybridMultilevel"/>
     <w:tmpl w:val="817E627C"/>
@@ -5594,7 +6423,7 @@
       </w:rPr>
     </w:lvl>
   </w:abstractNum>
-  <w:abstractNum w:abstractNumId="25" w15:restartNumberingAfterBreak="0">
+  <w:abstractNum w:abstractNumId="26" w15:restartNumberingAfterBreak="0">
     <w:nsid w:val="5F800581"/>
     <w:multiLevelType w:val="hybridMultilevel"/>
     <w:tmpl w:val="A1581456"/>
@@ -5707,7 +6536,7 @@
       </w:rPr>
     </w:lvl>
   </w:abstractNum>
-  <w:abstractNum w:abstractNumId="26" w15:restartNumberingAfterBreak="0">
+  <w:abstractNum w:abstractNumId="27" w15:restartNumberingAfterBreak="0">
     <w:nsid w:val="62C616CF"/>
     <w:multiLevelType w:val="hybridMultilevel"/>
     <w:tmpl w:val="1B167526"/>
@@ -5819,7 +6648,7 @@
       </w:rPr>
     </w:lvl>
   </w:abstractNum>
-  <w:abstractNum w:abstractNumId="27" w15:restartNumberingAfterBreak="0">
+  <w:abstractNum w:abstractNumId="28" w15:restartNumberingAfterBreak="0">
     <w:nsid w:val="6531471C"/>
     <w:multiLevelType w:val="multilevel"/>
     <w:tmpl w:val="83C6C802"/>
@@ -5968,7 +6797,7 @@
       </w:rPr>
     </w:lvl>
   </w:abstractNum>
-  <w:abstractNum w:abstractNumId="28" w15:restartNumberingAfterBreak="0">
+  <w:abstractNum w:abstractNumId="29" w15:restartNumberingAfterBreak="0">
     <w:nsid w:val="67B9794A"/>
     <w:multiLevelType w:val="hybridMultilevel"/>
     <w:tmpl w:val="EAA6997E"/>
@@ -6080,7 +6909,7 @@
       </w:rPr>
     </w:lvl>
   </w:abstractNum>
-  <w:abstractNum w:abstractNumId="29" w15:restartNumberingAfterBreak="0">
+  <w:abstractNum w:abstractNumId="30" w15:restartNumberingAfterBreak="0">
     <w:nsid w:val="6D524262"/>
     <w:multiLevelType w:val="hybridMultilevel"/>
     <w:tmpl w:val="BD027966"/>
@@ -6192,7 +7021,7 @@
       </w:rPr>
     </w:lvl>
   </w:abstractNum>
-  <w:abstractNum w:abstractNumId="30" w15:restartNumberingAfterBreak="0">
+  <w:abstractNum w:abstractNumId="31" w15:restartNumberingAfterBreak="0">
     <w:nsid w:val="705244B2"/>
     <w:multiLevelType w:val="hybridMultilevel"/>
     <w:tmpl w:val="45A685D2"/>
@@ -6304,7 +7133,7 @@
       </w:rPr>
     </w:lvl>
   </w:abstractNum>
-  <w:abstractNum w:abstractNumId="31" w15:restartNumberingAfterBreak="0">
+  <w:abstractNum w:abstractNumId="32" w15:restartNumberingAfterBreak="0">
     <w:nsid w:val="72917376"/>
     <w:multiLevelType w:val="hybridMultilevel"/>
     <w:tmpl w:val="9FACF550"/>
@@ -6390,7 +7219,7 @@
       </w:pPr>
     </w:lvl>
   </w:abstractNum>
-  <w:abstractNum w:abstractNumId="32" w15:restartNumberingAfterBreak="0">
+  <w:abstractNum w:abstractNumId="33" w15:restartNumberingAfterBreak="0">
     <w:nsid w:val="74F0753F"/>
     <w:multiLevelType w:val="hybridMultilevel"/>
     <w:tmpl w:val="7750B78E"/>
@@ -6503,7 +7332,7 @@
       </w:rPr>
     </w:lvl>
   </w:abstractNum>
-  <w:abstractNum w:abstractNumId="33" w15:restartNumberingAfterBreak="0">
+  <w:abstractNum w:abstractNumId="34" w15:restartNumberingAfterBreak="0">
     <w:nsid w:val="78616F35"/>
     <w:multiLevelType w:val="hybridMultilevel"/>
     <w:tmpl w:val="7F68611E"/>
@@ -6615,7 +7444,7 @@
       </w:rPr>
     </w:lvl>
   </w:abstractNum>
-  <w:abstractNum w:abstractNumId="34" w15:restartNumberingAfterBreak="0">
+  <w:abstractNum w:abstractNumId="35" w15:restartNumberingAfterBreak="0">
     <w:nsid w:val="7D173275"/>
     <w:multiLevelType w:val="hybridMultilevel"/>
     <w:tmpl w:val="DB8AE186"/>
@@ -6701,7 +7530,7 @@
       </w:pPr>
     </w:lvl>
   </w:abstractNum>
-  <w:abstractNum w:abstractNumId="35" w15:restartNumberingAfterBreak="0">
+  <w:abstractNum w:abstractNumId="36" w15:restartNumberingAfterBreak="0">
     <w:nsid w:val="7DFB5E0C"/>
     <w:multiLevelType w:val="hybridMultilevel"/>
     <w:tmpl w:val="A1F835CC"/>
@@ -6790,7 +7619,7 @@
       </w:pPr>
     </w:lvl>
   </w:abstractNum>
-  <w:abstractNum w:abstractNumId="36" w15:restartNumberingAfterBreak="0">
+  <w:abstractNum w:abstractNumId="37" w15:restartNumberingAfterBreak="0">
     <w:nsid w:val="7E443AD8"/>
     <w:multiLevelType w:val="hybridMultilevel"/>
     <w:tmpl w:val="A22E49A8"/>
@@ -6903,10 +7732,10 @@
     </w:lvl>
   </w:abstractNum>
   <w:num w:numId="1" w16cid:durableId="1365641405">
-    <w:abstractNumId w:val="13"/>
+    <w:abstractNumId w:val="14"/>
   </w:num>
   <w:num w:numId="2" w16cid:durableId="1372461794">
-    <w:abstractNumId w:val="31"/>
+    <w:abstractNumId w:val="32"/>
     <w:lvlOverride w:ilvl="0">
       <w:startOverride w:val="1"/>
     </w:lvlOverride>
@@ -6936,115 +7765,118 @@
     </w:lvlOverride>
   </w:num>
   <w:num w:numId="3" w16cid:durableId="487014716">
+    <w:abstractNumId w:val="14"/>
+  </w:num>
+  <w:num w:numId="4" w16cid:durableId="275065828">
+    <w:abstractNumId w:val="32"/>
+  </w:num>
+  <w:num w:numId="5" w16cid:durableId="1450275515">
+    <w:abstractNumId w:val="6"/>
+  </w:num>
+  <w:num w:numId="6" w16cid:durableId="1592003189">
+    <w:abstractNumId w:val="26"/>
+  </w:num>
+  <w:num w:numId="7" w16cid:durableId="1093939894">
+    <w:abstractNumId w:val="33"/>
+  </w:num>
+  <w:num w:numId="8" w16cid:durableId="647830194">
+    <w:abstractNumId w:val="16"/>
+  </w:num>
+  <w:num w:numId="9" w16cid:durableId="207031964">
+    <w:abstractNumId w:val="25"/>
+  </w:num>
+  <w:num w:numId="10" w16cid:durableId="524372554">
+    <w:abstractNumId w:val="4"/>
+  </w:num>
+  <w:num w:numId="11" w16cid:durableId="288781632">
+    <w:abstractNumId w:val="35"/>
+  </w:num>
+  <w:num w:numId="12" w16cid:durableId="639268641">
+    <w:abstractNumId w:val="37"/>
+  </w:num>
+  <w:num w:numId="13" w16cid:durableId="1517041355">
+    <w:abstractNumId w:val="29"/>
+  </w:num>
+  <w:num w:numId="14" w16cid:durableId="1992713684">
+    <w:abstractNumId w:val="20"/>
+  </w:num>
+  <w:num w:numId="15" w16cid:durableId="278686706">
+    <w:abstractNumId w:val="27"/>
+  </w:num>
+  <w:num w:numId="16" w16cid:durableId="131220928">
+    <w:abstractNumId w:val="31"/>
+  </w:num>
+  <w:num w:numId="17" w16cid:durableId="1602639150">
     <w:abstractNumId w:val="13"/>
   </w:num>
-  <w:num w:numId="4" w16cid:durableId="275065828">
-    <w:abstractNumId w:val="31"/>
+  <w:num w:numId="18" w16cid:durableId="1325549385">
+    <w:abstractNumId w:val="28"/>
   </w:num>
-  <w:num w:numId="5" w16cid:durableId="1450275515">
+  <w:num w:numId="19" w16cid:durableId="899555515">
     <w:abstractNumId w:val="5"/>
   </w:num>
-  <w:num w:numId="6" w16cid:durableId="1592003189">
-    <w:abstractNumId w:val="25"/>
-  </w:num>
-  <w:num w:numId="7" w16cid:durableId="1093939894">
-    <w:abstractNumId w:val="32"/>
-  </w:num>
-  <w:num w:numId="8" w16cid:durableId="647830194">
-    <w:abstractNumId w:val="15"/>
-  </w:num>
-  <w:num w:numId="9" w16cid:durableId="207031964">
-    <w:abstractNumId w:val="24"/>
-  </w:num>
-  <w:num w:numId="10" w16cid:durableId="524372554">
-    <w:abstractNumId w:val="3"/>
-  </w:num>
-  <w:num w:numId="11" w16cid:durableId="288781632">
-    <w:abstractNumId w:val="34"/>
-  </w:num>
-  <w:num w:numId="12" w16cid:durableId="639268641">
-    <w:abstractNumId w:val="36"/>
-  </w:num>
-  <w:num w:numId="13" w16cid:durableId="1517041355">
-    <w:abstractNumId w:val="28"/>
-  </w:num>
-  <w:num w:numId="14" w16cid:durableId="1992713684">
-    <w:abstractNumId w:val="19"/>
-  </w:num>
-  <w:num w:numId="15" w16cid:durableId="278686706">
-    <w:abstractNumId w:val="26"/>
-  </w:num>
-  <w:num w:numId="16" w16cid:durableId="131220928">
-    <w:abstractNumId w:val="30"/>
-  </w:num>
-  <w:num w:numId="17" w16cid:durableId="1602639150">
-    <w:abstractNumId w:val="12"/>
-  </w:num>
-  <w:num w:numId="18" w16cid:durableId="1325549385">
-    <w:abstractNumId w:val="27"/>
-  </w:num>
-  <w:num w:numId="19" w16cid:durableId="899555515">
-    <w:abstractNumId w:val="4"/>
-  </w:num>
   <w:num w:numId="20" w16cid:durableId="779187049">
-    <w:abstractNumId w:val="20"/>
+    <w:abstractNumId w:val="21"/>
   </w:num>
   <w:num w:numId="21" w16cid:durableId="32924587">
     <w:abstractNumId w:val="1"/>
   </w:num>
   <w:num w:numId="22" w16cid:durableId="1173716660">
+    <w:abstractNumId w:val="9"/>
+  </w:num>
+  <w:num w:numId="23" w16cid:durableId="1315334740">
+    <w:abstractNumId w:val="3"/>
+  </w:num>
+  <w:num w:numId="24" w16cid:durableId="810291653">
+    <w:abstractNumId w:val="19"/>
+  </w:num>
+  <w:num w:numId="25" w16cid:durableId="1430347511">
+    <w:abstractNumId w:val="34"/>
+  </w:num>
+  <w:num w:numId="26" w16cid:durableId="434863531">
+    <w:abstractNumId w:val="12"/>
+  </w:num>
+  <w:num w:numId="27" w16cid:durableId="1178931820">
+    <w:abstractNumId w:val="36"/>
+  </w:num>
+  <w:num w:numId="28" w16cid:durableId="1638954476">
+    <w:abstractNumId w:val="10"/>
+  </w:num>
+  <w:num w:numId="29" w16cid:durableId="1426460733">
+    <w:abstractNumId w:val="24"/>
+  </w:num>
+  <w:num w:numId="30" w16cid:durableId="1523788597">
+    <w:abstractNumId w:val="17"/>
+  </w:num>
+  <w:num w:numId="31" w16cid:durableId="1591693724">
+    <w:abstractNumId w:val="22"/>
+  </w:num>
+  <w:num w:numId="32" w16cid:durableId="772284555">
     <w:abstractNumId w:val="8"/>
   </w:num>
-  <w:num w:numId="23" w16cid:durableId="1315334740">
-    <w:abstractNumId w:val="2"/>
+  <w:num w:numId="33" w16cid:durableId="1353147147">
+    <w:abstractNumId w:val="15"/>
   </w:num>
-  <w:num w:numId="24" w16cid:durableId="810291653">
-    <w:abstractNumId w:val="18"/>
-  </w:num>
-  <w:num w:numId="25" w16cid:durableId="1430347511">
-    <w:abstractNumId w:val="33"/>
-  </w:num>
-  <w:num w:numId="26" w16cid:durableId="434863531">
+  <w:num w:numId="34" w16cid:durableId="590893895">
     <w:abstractNumId w:val="11"/>
   </w:num>
-  <w:num w:numId="27" w16cid:durableId="1178931820">
-    <w:abstractNumId w:val="35"/>
-  </w:num>
-  <w:num w:numId="28" w16cid:durableId="1638954476">
-    <w:abstractNumId w:val="9"/>
-  </w:num>
-  <w:num w:numId="29" w16cid:durableId="1426460733">
-    <w:abstractNumId w:val="23"/>
-  </w:num>
-  <w:num w:numId="30" w16cid:durableId="1523788597">
-    <w:abstractNumId w:val="16"/>
-  </w:num>
-  <w:num w:numId="31" w16cid:durableId="1591693724">
-    <w:abstractNumId w:val="21"/>
-  </w:num>
-  <w:num w:numId="32" w16cid:durableId="772284555">
+  <w:num w:numId="35" w16cid:durableId="388266294">
     <w:abstractNumId w:val="7"/>
   </w:num>
-  <w:num w:numId="33" w16cid:durableId="1353147147">
-    <w:abstractNumId w:val="14"/>
-  </w:num>
-  <w:num w:numId="34" w16cid:durableId="590893895">
-    <w:abstractNumId w:val="10"/>
-  </w:num>
-  <w:num w:numId="35" w16cid:durableId="388266294">
-    <w:abstractNumId w:val="6"/>
-  </w:num>
   <w:num w:numId="36" w16cid:durableId="1657227543">
-    <w:abstractNumId w:val="29"/>
+    <w:abstractNumId w:val="30"/>
   </w:num>
   <w:num w:numId="37" w16cid:durableId="217977294">
-    <w:abstractNumId w:val="22"/>
+    <w:abstractNumId w:val="23"/>
   </w:num>
   <w:num w:numId="38" w16cid:durableId="1296983981">
     <w:abstractNumId w:val="0"/>
   </w:num>
   <w:num w:numId="39" w16cid:durableId="1046031236">
-    <w:abstractNumId w:val="17"/>
+    <w:abstractNumId w:val="18"/>
+  </w:num>
+  <w:num w:numId="40" w16cid:durableId="1252197215">
+    <w:abstractNumId w:val="2"/>
   </w:num>
 </w:numbering>
 </file>
@@ -7498,6 +8330,7 @@
   <w:style w:type="character" w:default="1" w:styleId="Fuentedeprrafopredeter">
     <w:name w:val="Default Paragraph Font"/>
     <w:uiPriority w:val="1"/>
+    <w:semiHidden/>
     <w:unhideWhenUsed/>
   </w:style>
   <w:style w:type="table" w:default="1" w:styleId="Tablanormal">

</xml_diff>